<commit_message>
diseñar identidad visual e implementar requerimientos de Notificaciones
</commit_message>
<xml_diff>
--- a/TPI Grupo 14.docx
+++ b/TPI Grupo 14.docx
@@ -113,7 +113,7 @@
           <w:szCs w:val="20"/>
         </w:rPr>
       </w:pPr>
-      <w:hyperlink r:id="rId4" w:history="1">
+      <w:hyperlink r:id="rId5" w:history="1">
         <w:r>
           <w:rPr>
             <w:rStyle w:val="Hipervnculo"/>
@@ -137,30 +137,22 @@
           <w:szCs w:val="20"/>
         </w:rPr>
         <w:br/>
-      </w:r>
-      <w:r>
+        <w:t>Santiago Quiroga</w:t>
+      </w:r>
+    </w:p>
+    <w:p>
+      <w:pPr>
         <w:rPr>
           <w:sz w:val="20"/>
           <w:szCs w:val="20"/>
         </w:rPr>
-        <w:t>Santiago Quiroga</w:t>
-      </w:r>
-    </w:p>
-    <w:p>
-      <w:pPr>
-        <w:rPr>
-          <w:sz w:val="20"/>
-          <w:szCs w:val="20"/>
-          <w:lang w:val="en-US"/>
-        </w:rPr>
-      </w:pPr>
-      <w:hyperlink r:id="rId5" w:history="1">
+      </w:pPr>
+      <w:hyperlink r:id="rId6" w:history="1">
         <w:r>
           <w:rPr>
             <w:rStyle w:val="Hipervnculo"/>
             <w:sz w:val="20"/>
             <w:szCs w:val="20"/>
-            <w:lang w:val="en-US"/>
           </w:rPr>
           <w:t>santiquiroga2006@gmail.com</w:t>
         </w:r>
@@ -169,7 +161,6 @@
             <w:rStyle w:val="Hipervnculo"/>
             <w:sz w:val="20"/>
             <w:szCs w:val="20"/>
-            <w:lang w:val="en-US"/>
           </w:rPr>
           <w:br/>
         </w:r>
@@ -197,7 +188,7 @@
           <w:szCs w:val="20"/>
         </w:rPr>
       </w:pPr>
-      <w:hyperlink r:id="rId6" w:history="1">
+      <w:hyperlink r:id="rId7" w:history="1">
         <w:r>
           <w:rPr>
             <w:rStyle w:val="Hipervnculo"/>
@@ -256,7 +247,7 @@
           <w:szCs w:val="20"/>
         </w:rPr>
       </w:pPr>
-      <w:hyperlink r:id="rId7" w:history="1">
+      <w:hyperlink r:id="rId8" w:history="1">
         <w:r>
           <w:rPr>
             <w:rStyle w:val="Hipervnculo"/>
@@ -297,7 +288,7 @@
           <w:szCs w:val="20"/>
         </w:rPr>
       </w:pPr>
-      <w:hyperlink r:id="rId8" w:history="1">
+      <w:hyperlink r:id="rId9" w:history="1">
         <w:r>
           <w:rPr>
             <w:rStyle w:val="Hipervnculo"/>
@@ -338,7 +329,7 @@
           <w:szCs w:val="20"/>
         </w:rPr>
       </w:pPr>
-      <w:hyperlink r:id="rId9" w:history="1">
+      <w:hyperlink r:id="rId10" w:history="1">
         <w:r>
           <w:rPr>
             <w:rStyle w:val="Hipervnculo"/>
@@ -462,6 +453,95 @@
       </w:r>
     </w:p>
     <w:p/>
+    <w:p/>
+    <w:p/>
+    <w:p/>
+    <w:p/>
+    <w:p/>
+    <w:p/>
+    <w:p/>
+    <w:p/>
+    <w:p/>
+    <w:p/>
+    <w:p/>
+    <w:p/>
+    <w:p/>
+    <w:p/>
+    <w:p/>
+    <w:p>
+      <w:pPr>
+        <w:numPr>
+          <w:ilvl w:val="0"/>
+          <w:numId w:val="1"/>
+        </w:numPr>
+        <w:rPr>
+          <w:b/>
+          <w:bCs/>
+        </w:rPr>
+      </w:pPr>
+      <w:r>
+        <w:rPr>
+          <w:b/>
+          <w:bCs/>
+        </w:rPr>
+        <w:lastRenderedPageBreak/>
+        <w:t>RF12 – Emitir recordatorios de inicio de retiro</w:t>
+      </w:r>
+    </w:p>
+    <w:p>
+      <w:r>
+        <w:t>El sistema deberá emitir recordatorios a los usuarios informando sobre la proximidad del inicio de un retiro previamente agendado.</w:t>
+      </w:r>
+    </w:p>
+    <w:p>
+      <w:pPr>
+        <w:numPr>
+          <w:ilvl w:val="0"/>
+          <w:numId w:val="2"/>
+        </w:numPr>
+        <w:rPr>
+          <w:b/>
+          <w:bCs/>
+        </w:rPr>
+      </w:pPr>
+      <w:r>
+        <w:rPr>
+          <w:b/>
+          <w:bCs/>
+        </w:rPr>
+        <w:t>RF13 – Emitir recordatorios de pago pendientes</w:t>
+      </w:r>
+    </w:p>
+    <w:p>
+      <w:r>
+        <w:t>El sistema deberá emitir recordatorios a los usuarios indicando aquellos pagos que se encuentren en estado pendiente.</w:t>
+      </w:r>
+    </w:p>
+    <w:p>
+      <w:pPr>
+        <w:numPr>
+          <w:ilvl w:val="0"/>
+          <w:numId w:val="3"/>
+        </w:numPr>
+        <w:rPr>
+          <w:b/>
+          <w:bCs/>
+        </w:rPr>
+      </w:pPr>
+      <w:r>
+        <w:rPr>
+          <w:b/>
+          <w:bCs/>
+        </w:rPr>
+        <w:t>RF14 – Emitir alertas sobre retiros de interés</w:t>
+      </w:r>
+    </w:p>
+    <w:p>
+      <w:r>
+        <w:t>El sistema deberá emitir alertas a los usuarios sobre nuevos retiros que coincidan con sus preferencias o áreas de interés.</w:t>
+      </w:r>
+    </w:p>
+    <w:p/>
     <w:sectPr>
       <w:pgSz w:w="11906" w:h="16838"/>
       <w:pgMar w:top="1417" w:right="1701" w:bottom="1417" w:left="1701" w:header="708" w:footer="708" w:gutter="0"/>
@@ -470,6 +550,467 @@
     </w:sectPr>
   </w:body>
 </w:document>
+</file>
+
+<file path=word/numbering.xml><?xml version="1.0" encoding="utf-8"?>
+<w:numbering xmlns:wpc="http://schemas.microsoft.com/office/word/2010/wordprocessingCanvas" xmlns:cx="http://schemas.microsoft.com/office/drawing/2014/chartex" xmlns:cx1="http://schemas.microsoft.com/office/drawing/2015/9/8/chartex" xmlns:cx2="http://schemas.microsoft.com/office/drawing/2015/10/21/chartex" xmlns:cx3="http://schemas.microsoft.com/office/drawing/2016/5/9/chartex" xmlns:cx4="http://schemas.microsoft.com/office/drawing/2016/5/10/chartex" xmlns:cx5="http://schemas.microsoft.com/office/drawing/2016/5/11/chartex" xmlns:cx6="http://schemas.microsoft.com/office/drawing/2016/5/12/chartex" xmlns:cx7="http://schemas.microsoft.com/office/drawing/2016/5/13/chartex" xmlns:cx8="http://schemas.microsoft.com/office/drawing/2016/5/14/chartex" xmlns:mc="http://schemas.openxmlformats.org/markup-compatibility/2006" xmlns:aink="http://schemas.microsoft.com/office/drawing/2016/ink" xmlns:am3d="http://schemas.microsoft.com/office/drawing/2017/model3d" xmlns:o="urn:schemas-microsoft-com:office:office" xmlns:oel="http://schemas.microsoft.com/office/2019/extlst" xmlns:r="http://schemas.openxmlformats.org/officeDocument/2006/relationships" xmlns:m="http://schemas.openxmlformats.org/officeDocument/2006/math" xmlns:v="urn:schemas-microsoft-com:vml" xmlns:wp14="http://schemas.microsoft.com/office/word/2010/wordprocessingDrawing" xmlns:wp="http://schemas.openxmlformats.org/drawingml/2006/wordprocessingDrawing" xmlns:w10="urn:schemas-microsoft-com:office:word" xmlns:w="http://schemas.openxmlformats.org/wordprocessingml/2006/main" xmlns:w14="http://schemas.microsoft.com/office/word/2010/wordml" xmlns:w15="http://schemas.microsoft.com/office/word/2012/wordml" xmlns:w16cex="http://schemas.microsoft.com/office/word/2018/wordml/cex" xmlns:w16cid="http://schemas.microsoft.com/office/word/2016/wordml/cid" xmlns:w16="http://schemas.microsoft.com/office/word/2018/wordml" xmlns:w16du="http://schemas.microsoft.com/office/word/2023/wordml/word16du" xmlns:w16sdtdh="http://schemas.microsoft.com/office/word/2020/wordml/sdtdatahash" xmlns:w16sdtfl="http://schemas.microsoft.com/office/word/2024/wordml/sdtformatlock" xmlns:w16se="http://schemas.microsoft.com/office/word/2015/wordml/symex" xmlns:wpg="http://schemas.microsoft.com/office/word/2010/wordprocessingGroup" xmlns:wpi="http://schemas.microsoft.com/office/word/2010/wordprocessingInk" xmlns:wne="http://schemas.microsoft.com/office/word/2006/wordml" xmlns:wps="http://schemas.microsoft.com/office/word/2010/wordprocessingShape" mc:Ignorable="w14 w15 w16se w16cid w16 w16cex w16sdtdh w16sdtfl w16du wp14">
+  <w:abstractNum w:abstractNumId="0" w15:restartNumberingAfterBreak="0">
+    <w:nsid w:val="2C4E5803"/>
+    <w:multiLevelType w:val="multilevel"/>
+    <w:tmpl w:val="6818C3CC"/>
+    <w:lvl w:ilvl="0">
+      <w:start w:val="1"/>
+      <w:numFmt w:val="bullet"/>
+      <w:lvlText w:val=""/>
+      <w:lvlJc w:val="left"/>
+      <w:pPr>
+        <w:tabs>
+          <w:tab w:val="num" w:pos="720"/>
+        </w:tabs>
+        <w:ind w:left="720" w:hanging="360"/>
+      </w:pPr>
+      <w:rPr>
+        <w:rFonts w:ascii="Symbol" w:hAnsi="Symbol" w:hint="default"/>
+        <w:sz w:val="20"/>
+      </w:rPr>
+    </w:lvl>
+    <w:lvl w:ilvl="1" w:tentative="1">
+      <w:start w:val="1"/>
+      <w:numFmt w:val="bullet"/>
+      <w:lvlText w:val="o"/>
+      <w:lvlJc w:val="left"/>
+      <w:pPr>
+        <w:tabs>
+          <w:tab w:val="num" w:pos="1440"/>
+        </w:tabs>
+        <w:ind w:left="1440" w:hanging="360"/>
+      </w:pPr>
+      <w:rPr>
+        <w:rFonts w:ascii="Courier New" w:hAnsi="Courier New" w:hint="default"/>
+        <w:sz w:val="20"/>
+      </w:rPr>
+    </w:lvl>
+    <w:lvl w:ilvl="2" w:tentative="1">
+      <w:start w:val="1"/>
+      <w:numFmt w:val="bullet"/>
+      <w:lvlText w:val=""/>
+      <w:lvlJc w:val="left"/>
+      <w:pPr>
+        <w:tabs>
+          <w:tab w:val="num" w:pos="2160"/>
+        </w:tabs>
+        <w:ind w:left="2160" w:hanging="360"/>
+      </w:pPr>
+      <w:rPr>
+        <w:rFonts w:ascii="Wingdings" w:hAnsi="Wingdings" w:hint="default"/>
+        <w:sz w:val="20"/>
+      </w:rPr>
+    </w:lvl>
+    <w:lvl w:ilvl="3" w:tentative="1">
+      <w:start w:val="1"/>
+      <w:numFmt w:val="bullet"/>
+      <w:lvlText w:val=""/>
+      <w:lvlJc w:val="left"/>
+      <w:pPr>
+        <w:tabs>
+          <w:tab w:val="num" w:pos="2880"/>
+        </w:tabs>
+        <w:ind w:left="2880" w:hanging="360"/>
+      </w:pPr>
+      <w:rPr>
+        <w:rFonts w:ascii="Wingdings" w:hAnsi="Wingdings" w:hint="default"/>
+        <w:sz w:val="20"/>
+      </w:rPr>
+    </w:lvl>
+    <w:lvl w:ilvl="4" w:tentative="1">
+      <w:start w:val="1"/>
+      <w:numFmt w:val="bullet"/>
+      <w:lvlText w:val=""/>
+      <w:lvlJc w:val="left"/>
+      <w:pPr>
+        <w:tabs>
+          <w:tab w:val="num" w:pos="3600"/>
+        </w:tabs>
+        <w:ind w:left="3600" w:hanging="360"/>
+      </w:pPr>
+      <w:rPr>
+        <w:rFonts w:ascii="Wingdings" w:hAnsi="Wingdings" w:hint="default"/>
+        <w:sz w:val="20"/>
+      </w:rPr>
+    </w:lvl>
+    <w:lvl w:ilvl="5" w:tentative="1">
+      <w:start w:val="1"/>
+      <w:numFmt w:val="bullet"/>
+      <w:lvlText w:val=""/>
+      <w:lvlJc w:val="left"/>
+      <w:pPr>
+        <w:tabs>
+          <w:tab w:val="num" w:pos="4320"/>
+        </w:tabs>
+        <w:ind w:left="4320" w:hanging="360"/>
+      </w:pPr>
+      <w:rPr>
+        <w:rFonts w:ascii="Wingdings" w:hAnsi="Wingdings" w:hint="default"/>
+        <w:sz w:val="20"/>
+      </w:rPr>
+    </w:lvl>
+    <w:lvl w:ilvl="6" w:tentative="1">
+      <w:start w:val="1"/>
+      <w:numFmt w:val="bullet"/>
+      <w:lvlText w:val=""/>
+      <w:lvlJc w:val="left"/>
+      <w:pPr>
+        <w:tabs>
+          <w:tab w:val="num" w:pos="5040"/>
+        </w:tabs>
+        <w:ind w:left="5040" w:hanging="360"/>
+      </w:pPr>
+      <w:rPr>
+        <w:rFonts w:ascii="Wingdings" w:hAnsi="Wingdings" w:hint="default"/>
+        <w:sz w:val="20"/>
+      </w:rPr>
+    </w:lvl>
+    <w:lvl w:ilvl="7" w:tentative="1">
+      <w:start w:val="1"/>
+      <w:numFmt w:val="bullet"/>
+      <w:lvlText w:val=""/>
+      <w:lvlJc w:val="left"/>
+      <w:pPr>
+        <w:tabs>
+          <w:tab w:val="num" w:pos="5760"/>
+        </w:tabs>
+        <w:ind w:left="5760" w:hanging="360"/>
+      </w:pPr>
+      <w:rPr>
+        <w:rFonts w:ascii="Wingdings" w:hAnsi="Wingdings" w:hint="default"/>
+        <w:sz w:val="20"/>
+      </w:rPr>
+    </w:lvl>
+    <w:lvl w:ilvl="8" w:tentative="1">
+      <w:start w:val="1"/>
+      <w:numFmt w:val="bullet"/>
+      <w:lvlText w:val=""/>
+      <w:lvlJc w:val="left"/>
+      <w:pPr>
+        <w:tabs>
+          <w:tab w:val="num" w:pos="6480"/>
+        </w:tabs>
+        <w:ind w:left="6480" w:hanging="360"/>
+      </w:pPr>
+      <w:rPr>
+        <w:rFonts w:ascii="Wingdings" w:hAnsi="Wingdings" w:hint="default"/>
+        <w:sz w:val="20"/>
+      </w:rPr>
+    </w:lvl>
+  </w:abstractNum>
+  <w:abstractNum w:abstractNumId="1" w15:restartNumberingAfterBreak="0">
+    <w:nsid w:val="48D2547C"/>
+    <w:multiLevelType w:val="multilevel"/>
+    <w:tmpl w:val="A7FE4386"/>
+    <w:lvl w:ilvl="0">
+      <w:start w:val="1"/>
+      <w:numFmt w:val="bullet"/>
+      <w:lvlText w:val=""/>
+      <w:lvlJc w:val="left"/>
+      <w:pPr>
+        <w:tabs>
+          <w:tab w:val="num" w:pos="720"/>
+        </w:tabs>
+        <w:ind w:left="720" w:hanging="360"/>
+      </w:pPr>
+      <w:rPr>
+        <w:rFonts w:ascii="Symbol" w:hAnsi="Symbol" w:hint="default"/>
+        <w:sz w:val="20"/>
+      </w:rPr>
+    </w:lvl>
+    <w:lvl w:ilvl="1" w:tentative="1">
+      <w:start w:val="1"/>
+      <w:numFmt w:val="bullet"/>
+      <w:lvlText w:val="o"/>
+      <w:lvlJc w:val="left"/>
+      <w:pPr>
+        <w:tabs>
+          <w:tab w:val="num" w:pos="1440"/>
+        </w:tabs>
+        <w:ind w:left="1440" w:hanging="360"/>
+      </w:pPr>
+      <w:rPr>
+        <w:rFonts w:ascii="Courier New" w:hAnsi="Courier New" w:hint="default"/>
+        <w:sz w:val="20"/>
+      </w:rPr>
+    </w:lvl>
+    <w:lvl w:ilvl="2" w:tentative="1">
+      <w:start w:val="1"/>
+      <w:numFmt w:val="bullet"/>
+      <w:lvlText w:val=""/>
+      <w:lvlJc w:val="left"/>
+      <w:pPr>
+        <w:tabs>
+          <w:tab w:val="num" w:pos="2160"/>
+        </w:tabs>
+        <w:ind w:left="2160" w:hanging="360"/>
+      </w:pPr>
+      <w:rPr>
+        <w:rFonts w:ascii="Wingdings" w:hAnsi="Wingdings" w:hint="default"/>
+        <w:sz w:val="20"/>
+      </w:rPr>
+    </w:lvl>
+    <w:lvl w:ilvl="3" w:tentative="1">
+      <w:start w:val="1"/>
+      <w:numFmt w:val="bullet"/>
+      <w:lvlText w:val=""/>
+      <w:lvlJc w:val="left"/>
+      <w:pPr>
+        <w:tabs>
+          <w:tab w:val="num" w:pos="2880"/>
+        </w:tabs>
+        <w:ind w:left="2880" w:hanging="360"/>
+      </w:pPr>
+      <w:rPr>
+        <w:rFonts w:ascii="Wingdings" w:hAnsi="Wingdings" w:hint="default"/>
+        <w:sz w:val="20"/>
+      </w:rPr>
+    </w:lvl>
+    <w:lvl w:ilvl="4" w:tentative="1">
+      <w:start w:val="1"/>
+      <w:numFmt w:val="bullet"/>
+      <w:lvlText w:val=""/>
+      <w:lvlJc w:val="left"/>
+      <w:pPr>
+        <w:tabs>
+          <w:tab w:val="num" w:pos="3600"/>
+        </w:tabs>
+        <w:ind w:left="3600" w:hanging="360"/>
+      </w:pPr>
+      <w:rPr>
+        <w:rFonts w:ascii="Wingdings" w:hAnsi="Wingdings" w:hint="default"/>
+        <w:sz w:val="20"/>
+      </w:rPr>
+    </w:lvl>
+    <w:lvl w:ilvl="5" w:tentative="1">
+      <w:start w:val="1"/>
+      <w:numFmt w:val="bullet"/>
+      <w:lvlText w:val=""/>
+      <w:lvlJc w:val="left"/>
+      <w:pPr>
+        <w:tabs>
+          <w:tab w:val="num" w:pos="4320"/>
+        </w:tabs>
+        <w:ind w:left="4320" w:hanging="360"/>
+      </w:pPr>
+      <w:rPr>
+        <w:rFonts w:ascii="Wingdings" w:hAnsi="Wingdings" w:hint="default"/>
+        <w:sz w:val="20"/>
+      </w:rPr>
+    </w:lvl>
+    <w:lvl w:ilvl="6" w:tentative="1">
+      <w:start w:val="1"/>
+      <w:numFmt w:val="bullet"/>
+      <w:lvlText w:val=""/>
+      <w:lvlJc w:val="left"/>
+      <w:pPr>
+        <w:tabs>
+          <w:tab w:val="num" w:pos="5040"/>
+        </w:tabs>
+        <w:ind w:left="5040" w:hanging="360"/>
+      </w:pPr>
+      <w:rPr>
+        <w:rFonts w:ascii="Wingdings" w:hAnsi="Wingdings" w:hint="default"/>
+        <w:sz w:val="20"/>
+      </w:rPr>
+    </w:lvl>
+    <w:lvl w:ilvl="7" w:tentative="1">
+      <w:start w:val="1"/>
+      <w:numFmt w:val="bullet"/>
+      <w:lvlText w:val=""/>
+      <w:lvlJc w:val="left"/>
+      <w:pPr>
+        <w:tabs>
+          <w:tab w:val="num" w:pos="5760"/>
+        </w:tabs>
+        <w:ind w:left="5760" w:hanging="360"/>
+      </w:pPr>
+      <w:rPr>
+        <w:rFonts w:ascii="Wingdings" w:hAnsi="Wingdings" w:hint="default"/>
+        <w:sz w:val="20"/>
+      </w:rPr>
+    </w:lvl>
+    <w:lvl w:ilvl="8" w:tentative="1">
+      <w:start w:val="1"/>
+      <w:numFmt w:val="bullet"/>
+      <w:lvlText w:val=""/>
+      <w:lvlJc w:val="left"/>
+      <w:pPr>
+        <w:tabs>
+          <w:tab w:val="num" w:pos="6480"/>
+        </w:tabs>
+        <w:ind w:left="6480" w:hanging="360"/>
+      </w:pPr>
+      <w:rPr>
+        <w:rFonts w:ascii="Wingdings" w:hAnsi="Wingdings" w:hint="default"/>
+        <w:sz w:val="20"/>
+      </w:rPr>
+    </w:lvl>
+  </w:abstractNum>
+  <w:abstractNum w:abstractNumId="2" w15:restartNumberingAfterBreak="0">
+    <w:nsid w:val="6F8F1595"/>
+    <w:multiLevelType w:val="multilevel"/>
+    <w:tmpl w:val="477E362C"/>
+    <w:lvl w:ilvl="0">
+      <w:start w:val="1"/>
+      <w:numFmt w:val="bullet"/>
+      <w:lvlText w:val=""/>
+      <w:lvlJc w:val="left"/>
+      <w:pPr>
+        <w:tabs>
+          <w:tab w:val="num" w:pos="720"/>
+        </w:tabs>
+        <w:ind w:left="720" w:hanging="360"/>
+      </w:pPr>
+      <w:rPr>
+        <w:rFonts w:ascii="Symbol" w:hAnsi="Symbol" w:hint="default"/>
+        <w:sz w:val="20"/>
+      </w:rPr>
+    </w:lvl>
+    <w:lvl w:ilvl="1" w:tentative="1">
+      <w:start w:val="1"/>
+      <w:numFmt w:val="bullet"/>
+      <w:lvlText w:val="o"/>
+      <w:lvlJc w:val="left"/>
+      <w:pPr>
+        <w:tabs>
+          <w:tab w:val="num" w:pos="1440"/>
+        </w:tabs>
+        <w:ind w:left="1440" w:hanging="360"/>
+      </w:pPr>
+      <w:rPr>
+        <w:rFonts w:ascii="Courier New" w:hAnsi="Courier New" w:hint="default"/>
+        <w:sz w:val="20"/>
+      </w:rPr>
+    </w:lvl>
+    <w:lvl w:ilvl="2" w:tentative="1">
+      <w:start w:val="1"/>
+      <w:numFmt w:val="bullet"/>
+      <w:lvlText w:val=""/>
+      <w:lvlJc w:val="left"/>
+      <w:pPr>
+        <w:tabs>
+          <w:tab w:val="num" w:pos="2160"/>
+        </w:tabs>
+        <w:ind w:left="2160" w:hanging="360"/>
+      </w:pPr>
+      <w:rPr>
+        <w:rFonts w:ascii="Wingdings" w:hAnsi="Wingdings" w:hint="default"/>
+        <w:sz w:val="20"/>
+      </w:rPr>
+    </w:lvl>
+    <w:lvl w:ilvl="3" w:tentative="1">
+      <w:start w:val="1"/>
+      <w:numFmt w:val="bullet"/>
+      <w:lvlText w:val=""/>
+      <w:lvlJc w:val="left"/>
+      <w:pPr>
+        <w:tabs>
+          <w:tab w:val="num" w:pos="2880"/>
+        </w:tabs>
+        <w:ind w:left="2880" w:hanging="360"/>
+      </w:pPr>
+      <w:rPr>
+        <w:rFonts w:ascii="Wingdings" w:hAnsi="Wingdings" w:hint="default"/>
+        <w:sz w:val="20"/>
+      </w:rPr>
+    </w:lvl>
+    <w:lvl w:ilvl="4" w:tentative="1">
+      <w:start w:val="1"/>
+      <w:numFmt w:val="bullet"/>
+      <w:lvlText w:val=""/>
+      <w:lvlJc w:val="left"/>
+      <w:pPr>
+        <w:tabs>
+          <w:tab w:val="num" w:pos="3600"/>
+        </w:tabs>
+        <w:ind w:left="3600" w:hanging="360"/>
+      </w:pPr>
+      <w:rPr>
+        <w:rFonts w:ascii="Wingdings" w:hAnsi="Wingdings" w:hint="default"/>
+        <w:sz w:val="20"/>
+      </w:rPr>
+    </w:lvl>
+    <w:lvl w:ilvl="5" w:tentative="1">
+      <w:start w:val="1"/>
+      <w:numFmt w:val="bullet"/>
+      <w:lvlText w:val=""/>
+      <w:lvlJc w:val="left"/>
+      <w:pPr>
+        <w:tabs>
+          <w:tab w:val="num" w:pos="4320"/>
+        </w:tabs>
+        <w:ind w:left="4320" w:hanging="360"/>
+      </w:pPr>
+      <w:rPr>
+        <w:rFonts w:ascii="Wingdings" w:hAnsi="Wingdings" w:hint="default"/>
+        <w:sz w:val="20"/>
+      </w:rPr>
+    </w:lvl>
+    <w:lvl w:ilvl="6" w:tentative="1">
+      <w:start w:val="1"/>
+      <w:numFmt w:val="bullet"/>
+      <w:lvlText w:val=""/>
+      <w:lvlJc w:val="left"/>
+      <w:pPr>
+        <w:tabs>
+          <w:tab w:val="num" w:pos="5040"/>
+        </w:tabs>
+        <w:ind w:left="5040" w:hanging="360"/>
+      </w:pPr>
+      <w:rPr>
+        <w:rFonts w:ascii="Wingdings" w:hAnsi="Wingdings" w:hint="default"/>
+        <w:sz w:val="20"/>
+      </w:rPr>
+    </w:lvl>
+    <w:lvl w:ilvl="7" w:tentative="1">
+      <w:start w:val="1"/>
+      <w:numFmt w:val="bullet"/>
+      <w:lvlText w:val=""/>
+      <w:lvlJc w:val="left"/>
+      <w:pPr>
+        <w:tabs>
+          <w:tab w:val="num" w:pos="5760"/>
+        </w:tabs>
+        <w:ind w:left="5760" w:hanging="360"/>
+      </w:pPr>
+      <w:rPr>
+        <w:rFonts w:ascii="Wingdings" w:hAnsi="Wingdings" w:hint="default"/>
+        <w:sz w:val="20"/>
+      </w:rPr>
+    </w:lvl>
+    <w:lvl w:ilvl="8" w:tentative="1">
+      <w:start w:val="1"/>
+      <w:numFmt w:val="bullet"/>
+      <w:lvlText w:val=""/>
+      <w:lvlJc w:val="left"/>
+      <w:pPr>
+        <w:tabs>
+          <w:tab w:val="num" w:pos="6480"/>
+        </w:tabs>
+        <w:ind w:left="6480" w:hanging="360"/>
+      </w:pPr>
+      <w:rPr>
+        <w:rFonts w:ascii="Wingdings" w:hAnsi="Wingdings" w:hint="default"/>
+        <w:sz w:val="20"/>
+      </w:rPr>
+    </w:lvl>
+  </w:abstractNum>
+  <w:num w:numId="1" w16cid:durableId="1536380346">
+    <w:abstractNumId w:val="2"/>
+  </w:num>
+  <w:num w:numId="2" w16cid:durableId="284701083">
+    <w:abstractNumId w:val="0"/>
+  </w:num>
+  <w:num w:numId="3" w16cid:durableId="1702709618">
+    <w:abstractNumId w:val="1"/>
+  </w:num>
+</w:numbering>
 </file>
 
 <file path=word/styles.xml><?xml version="1.0" encoding="utf-8"?>

</xml_diff>

<commit_message>
Desarrollar enunciado del caso e integrar correcciones docentes en enunciado
</commit_message>
<xml_diff>
--- a/TPI Grupo 14.docx
+++ b/TPI Grupo 14.docx
@@ -214,31 +214,13 @@
           <w:szCs w:val="20"/>
         </w:rPr>
       </w:pPr>
-      <w:proofErr w:type="spellStart"/>
       <w:r>
         <w:rPr>
           <w:sz w:val="20"/>
           <w:szCs w:val="20"/>
         </w:rPr>
-        <w:t>Fabrizio</w:t>
-      </w:r>
-      <w:proofErr w:type="spellEnd"/>
-      <w:r>
-        <w:rPr>
-          <w:sz w:val="20"/>
-          <w:szCs w:val="20"/>
-        </w:rPr>
-        <w:t xml:space="preserve"> </w:t>
-      </w:r>
-      <w:proofErr w:type="spellStart"/>
-      <w:r>
-        <w:rPr>
-          <w:sz w:val="20"/>
-          <w:szCs w:val="20"/>
-        </w:rPr>
-        <w:t>Sanchez</w:t>
-      </w:r>
-      <w:proofErr w:type="spellEnd"/>
+        <w:t>Fabrizio Sanchez</w:t>
+      </w:r>
     </w:p>
     <w:p>
       <w:pPr>
@@ -470,6 +452,63 @@
     <w:p/>
     <w:p>
       <w:pPr>
+        <w:rPr>
+          <w:b/>
+          <w:bCs/>
+        </w:rPr>
+      </w:pPr>
+      <w:r>
+        <w:rPr>
+          <w:b/>
+          <w:bCs/>
+        </w:rPr>
+        <w:lastRenderedPageBreak/>
+        <w:t>Enunciado del Caso de Estudio</w:t>
+      </w:r>
+    </w:p>
+    <w:p>
+      <w:r>
+        <w:t>El presente proyecto consiste en el desarrollo de una aplicación de uso personal destinada a personas que participan regularmente en retiros holísticos grupales. El objetivo principal es brindar una herramienta centralizada que facilite la planificación, el seguimiento de actividades y la gestión de gastos asociados, diseñada estrictamente desde la perspectiva del usuario final y no de una empresa organizadora.</w:t>
+      </w:r>
+    </w:p>
+    <w:p>
+      <w:r>
+        <w:t>Actualmente, los usuarios descubren estas experiencias a través de redes sociales, páginas web o recomendaciones, teniendo que comunicarse por Instagram, WhatsApp o correo electrónico para solicitar datos sobre fechas, costos y disponibilidad. Debido a que esta información queda dispersa en múltiples plataformas, se suele recurrir a planillas de cálculo o anotaciones manuales para registrar el nombre del retiro, ubicación, duración, requisitos y el contacto del organizador. Sin embargo, este método dificulta el seguimiento, la consulta histórica y el control de los datos.</w:t>
+      </w:r>
+    </w:p>
+    <w:p>
+      <w:r>
+        <w:t>Para solucionar esto, el usuario necesita una herramienta que le permita registrar los retiros de interés con sus estados correspondientes (interesado, reservado, pagado o cancelado), adjuntar imágenes de los destinos y agendar acompañantes detallando su vínculo y los retiros previos que compartieron juntos. También, el sistema debe permitir registrar los pagos con su fecha y estado, calcular automáticamente los gastos mensuales o anuales, y ofrecer la opción de filtrar y compartir la información de los eventos mediante medios externos.</w:t>
+      </w:r>
+    </w:p>
+    <w:p>
+      <w:r>
+        <w:t xml:space="preserve">El sistema también debe notificar recordatorios sobre inicios de retiros, alertas de pagos pendientes y avisos sobre eventos de interés que están por vencer. Finalmente, una vez concluido un retiro, la </w:t>
+      </w:r>
+      <w:proofErr w:type="gramStart"/>
+      <w:r>
+        <w:t>app</w:t>
+      </w:r>
+      <w:proofErr w:type="gramEnd"/>
+      <w:r>
+        <w:t xml:space="preserve"> permitirá registrar valoraciones personales de la experiencia, conservando un historial que facilite futuras decisiones.</w:t>
+      </w:r>
+    </w:p>
+    <w:p/>
+    <w:p/>
+    <w:p/>
+    <w:p/>
+    <w:p/>
+    <w:p/>
+    <w:p/>
+    <w:p/>
+    <w:p/>
+    <w:p/>
+    <w:p/>
+    <w:p/>
+    <w:p/>
+    <w:p>
+      <w:pPr>
         <w:numPr>
           <w:ilvl w:val="0"/>
           <w:numId w:val="1"/>
@@ -484,7 +523,6 @@
           <w:b/>
           <w:bCs/>
         </w:rPr>
-        <w:lastRenderedPageBreak/>
         <w:t>RF12 – Emitir recordatorios de inicio de retiro</w:t>
       </w:r>
     </w:p>

</xml_diff>

<commit_message>
Implementar requerimientos de Retiros y detallar necesidades operativas
</commit_message>
<xml_diff>
--- a/TPI Grupo 14.docx
+++ b/TPI Grupo 14.docx
@@ -1,6 +1,6 @@
 
 <file path=word/document.xml><?xml version="1.0" encoding="utf-8"?>
-<w:document xmlns:wpc="http://schemas.microsoft.com/office/word/2010/wordprocessingCanvas" xmlns:cx="http://schemas.microsoft.com/office/drawing/2014/chartex" xmlns:cx1="http://schemas.microsoft.com/office/drawing/2015/9/8/chartex" xmlns:cx2="http://schemas.microsoft.com/office/drawing/2015/10/21/chartex" xmlns:cx3="http://schemas.microsoft.com/office/drawing/2016/5/9/chartex" xmlns:cx4="http://schemas.microsoft.com/office/drawing/2016/5/10/chartex" xmlns:cx5="http://schemas.microsoft.com/office/drawing/2016/5/11/chartex" xmlns:cx6="http://schemas.microsoft.com/office/drawing/2016/5/12/chartex" xmlns:cx7="http://schemas.microsoft.com/office/drawing/2016/5/13/chartex" xmlns:cx8="http://schemas.microsoft.com/office/drawing/2016/5/14/chartex" xmlns:mc="http://schemas.openxmlformats.org/markup-compatibility/2006" xmlns:aink="http://schemas.microsoft.com/office/drawing/2016/ink" xmlns:am3d="http://schemas.microsoft.com/office/drawing/2017/model3d" xmlns:o="urn:schemas-microsoft-com:office:office" xmlns:oel="http://schemas.microsoft.com/office/2019/extlst" xmlns:r="http://schemas.openxmlformats.org/officeDocument/2006/relationships" xmlns:m="http://schemas.openxmlformats.org/officeDocument/2006/math" xmlns:v="urn:schemas-microsoft-com:vml" xmlns:wp14="http://schemas.microsoft.com/office/word/2010/wordprocessingDrawing" xmlns:wp="http://schemas.openxmlformats.org/drawingml/2006/wordprocessingDrawing" xmlns:w10="urn:schemas-microsoft-com:office:word" xmlns:w="http://schemas.openxmlformats.org/wordprocessingml/2006/main" xmlns:w14="http://schemas.microsoft.com/office/word/2010/wordml" xmlns:w15="http://schemas.microsoft.com/office/word/2012/wordml" xmlns:w16cex="http://schemas.microsoft.com/office/word/2018/wordml/cex" xmlns:w16cid="http://schemas.microsoft.com/office/word/2016/wordml/cid" xmlns:w16="http://schemas.microsoft.com/office/word/2018/wordml" xmlns:w16du="http://schemas.microsoft.com/office/word/2023/wordml/word16du" xmlns:w16sdtdh="http://schemas.microsoft.com/office/word/2020/wordml/sdtdatahash" xmlns:w16sdtfl="http://schemas.microsoft.com/office/word/2024/wordml/sdtformatlock" xmlns:w16se="http://schemas.microsoft.com/office/word/2015/wordml/symex" xmlns:wpg="http://schemas.microsoft.com/office/word/2010/wordprocessingGroup" xmlns:wpi="http://schemas.microsoft.com/office/word/2010/wordprocessingInk" xmlns:wne="http://schemas.microsoft.com/office/word/2006/wordml" xmlns:wps="http://schemas.microsoft.com/office/word/2010/wordprocessingShape" mc:Ignorable="w14 w15 w16se w16cid w16 w16cex w16sdtdh w16sdtfl w16du wp14">
+<w:document xmlns:wpc="http://schemas.microsoft.com/office/word/2010/wordprocessingCanvas" xmlns:cx="http://schemas.microsoft.com/office/drawing/2014/chartex" xmlns:mc="http://schemas.openxmlformats.org/markup-compatibility/2006" xmlns:o="urn:schemas-microsoft-com:office:office" xmlns:r="http://schemas.openxmlformats.org/officeDocument/2006/relationships" xmlns:m="http://schemas.openxmlformats.org/officeDocument/2006/math" xmlns:v="urn:schemas-microsoft-com:vml" xmlns:wp14="http://schemas.microsoft.com/office/word/2010/wordprocessingDrawing" xmlns:wp="http://schemas.openxmlformats.org/drawingml/2006/wordprocessingDrawing" xmlns:w10="urn:schemas-microsoft-com:office:word" xmlns:w="http://schemas.openxmlformats.org/wordprocessingml/2006/main" xmlns:w14="http://schemas.microsoft.com/office/word/2010/wordml" xmlns:w15="http://schemas.microsoft.com/office/word/2012/wordml" xmlns:w16se="http://schemas.microsoft.com/office/word/2015/wordml/symex" xmlns:wpg="http://schemas.microsoft.com/office/word/2010/wordprocessingGroup" xmlns:wpi="http://schemas.microsoft.com/office/word/2010/wordprocessingInk" xmlns:wne="http://schemas.microsoft.com/office/word/2006/wordml" xmlns:wps="http://schemas.microsoft.com/office/word/2010/wordprocessingShape" mc:Ignorable="w14 w15 w16se wp14">
   <w:body>
     <w:p/>
     <w:p>
@@ -113,7 +113,7 @@
           <w:szCs w:val="20"/>
         </w:rPr>
       </w:pPr>
-      <w:hyperlink r:id="rId5" w:history="1">
+      <w:hyperlink r:id="rId7" w:history="1">
         <w:r>
           <w:rPr>
             <w:rStyle w:val="Hipervnculo"/>
@@ -147,7 +147,7 @@
           <w:szCs w:val="20"/>
         </w:rPr>
       </w:pPr>
-      <w:hyperlink r:id="rId6" w:history="1">
+      <w:hyperlink r:id="rId8" w:history="1">
         <w:r>
           <w:rPr>
             <w:rStyle w:val="Hipervnculo"/>
@@ -188,7 +188,7 @@
           <w:szCs w:val="20"/>
         </w:rPr>
       </w:pPr>
-      <w:hyperlink r:id="rId7" w:history="1">
+      <w:hyperlink r:id="rId9" w:history="1">
         <w:r>
           <w:rPr>
             <w:rStyle w:val="Hipervnculo"/>
@@ -229,7 +229,7 @@
           <w:szCs w:val="20"/>
         </w:rPr>
       </w:pPr>
-      <w:hyperlink r:id="rId8" w:history="1">
+      <w:hyperlink r:id="rId10" w:history="1">
         <w:r>
           <w:rPr>
             <w:rStyle w:val="Hipervnculo"/>
@@ -270,7 +270,7 @@
           <w:szCs w:val="20"/>
         </w:rPr>
       </w:pPr>
-      <w:hyperlink r:id="rId9" w:history="1">
+      <w:hyperlink r:id="rId11" w:history="1">
         <w:r>
           <w:rPr>
             <w:rStyle w:val="Hipervnculo"/>
@@ -311,7 +311,7 @@
           <w:szCs w:val="20"/>
         </w:rPr>
       </w:pPr>
-      <w:hyperlink r:id="rId10" w:history="1">
+      <w:hyperlink r:id="rId12" w:history="1">
         <w:r>
           <w:rPr>
             <w:rStyle w:val="Hipervnculo"/>
@@ -450,6 +450,7 @@
     <w:p/>
     <w:p/>
     <w:p/>
+    <w:p/>
     <w:p>
       <w:pPr>
         <w:rPr>
@@ -483,15 +484,7 @@
     </w:p>
     <w:p>
       <w:r>
-        <w:t xml:space="preserve">El sistema también debe notificar recordatorios sobre inicios de retiros, alertas de pagos pendientes y avisos sobre eventos de interés que están por vencer. Finalmente, una vez concluido un retiro, la </w:t>
-      </w:r>
-      <w:proofErr w:type="gramStart"/>
-      <w:r>
-        <w:t>app</w:t>
-      </w:r>
-      <w:proofErr w:type="gramEnd"/>
-      <w:r>
-        <w:t xml:space="preserve"> permitirá registrar valoraciones personales de la experiencia, conservando un historial que facilite futuras decisiones.</w:t>
+        <w:t>El sistema también debe notificar recordatorios sobre inicios de retiros, alertas de pagos pendientes y avisos sobre eventos de interés que están por vencer. Finalmente, una vez concluido un retiro, la app permitirá registrar valoraciones personales de la experiencia, conservando un historial que facilite futuras decisiones.</w:t>
       </w:r>
     </w:p>
     <w:p/>
@@ -504,7 +497,875 @@
     <w:p/>
     <w:p/>
     <w:p/>
-    <w:p/>
+    <w:p>
+      <w:pPr>
+        <w:pStyle w:val="Ttulo1"/>
+        <w:spacing w:before="400" w:after="120"/>
+        <w:rPr>
+          <w:rFonts w:asciiTheme="minorHAnsi" w:hAnsiTheme="minorHAnsi" w:cs="Times New Roman"/>
+        </w:rPr>
+      </w:pPr>
+      <w:r>
+        <w:rPr>
+          <w:rFonts w:asciiTheme="minorHAnsi" w:hAnsiTheme="minorHAnsi" w:cs="Times New Roman"/>
+          <w:color w:val="000000"/>
+          <w:sz w:val="46"/>
+          <w:szCs w:val="46"/>
+        </w:rPr>
+        <w:t>Requerimientos funcionales:</w:t>
+      </w:r>
+    </w:p>
+    <w:p>
+      <w:pPr>
+        <w:pStyle w:val="NormalWeb"/>
+        <w:numPr>
+          <w:ilvl w:val="0"/>
+          <w:numId w:val="4"/>
+        </w:numPr>
+        <w:spacing w:before="240" w:beforeAutospacing="0" w:after="240" w:afterAutospacing="0"/>
+        <w:textAlignment w:val="baseline"/>
+        <w:rPr>
+          <w:rFonts w:asciiTheme="minorHAnsi" w:hAnsiTheme="minorHAnsi"/>
+          <w:b/>
+          <w:bCs/>
+          <w:color w:val="000000"/>
+        </w:rPr>
+      </w:pPr>
+      <w:r>
+        <w:rPr>
+          <w:rFonts w:asciiTheme="minorHAnsi" w:hAnsiTheme="minorHAnsi"/>
+          <w:b/>
+          <w:bCs/>
+          <w:color w:val="000000"/>
+          <w:shd w:val="clear" w:color="auto" w:fill="FFFFFF"/>
+        </w:rPr>
+        <w:t xml:space="preserve">RF01 – Registrar </w:t>
+      </w:r>
+      <w:proofErr w:type="spellStart"/>
+      <w:r>
+        <w:rPr>
+          <w:rFonts w:asciiTheme="minorHAnsi" w:hAnsiTheme="minorHAnsi"/>
+          <w:b/>
+          <w:bCs/>
+          <w:color w:val="000000"/>
+          <w:shd w:val="clear" w:color="auto" w:fill="FFFFFF"/>
+        </w:rPr>
+        <w:t>retiro</w:t>
+      </w:r>
+      <w:proofErr w:type="spellEnd"/>
+    </w:p>
+    <w:p>
+      <w:pPr>
+        <w:pStyle w:val="NormalWeb"/>
+        <w:spacing w:before="240" w:beforeAutospacing="0" w:after="240" w:afterAutospacing="0"/>
+        <w:ind w:left="720"/>
+        <w:rPr>
+          <w:rFonts w:asciiTheme="minorHAnsi" w:hAnsiTheme="minorHAnsi"/>
+          <w:lang w:val="es-AR"/>
+        </w:rPr>
+      </w:pPr>
+      <w:r>
+        <w:rPr>
+          <w:rFonts w:asciiTheme="minorHAnsi" w:hAnsiTheme="minorHAnsi"/>
+          <w:color w:val="000000"/>
+          <w:shd w:val="clear" w:color="auto" w:fill="FFFFFF"/>
+          <w:lang w:val="es-AR"/>
+        </w:rPr>
+        <w:t>El sistema deberá permitir registrar un nuevo retiro indicando fecha, horario, descripción, duración, ubicación, costo, acompañante, contacto, valoración, requisitos, estado e imágenes.</w:t>
+      </w:r>
+    </w:p>
+    <w:p>
+      <w:pPr>
+        <w:pStyle w:val="NormalWeb"/>
+        <w:numPr>
+          <w:ilvl w:val="0"/>
+          <w:numId w:val="5"/>
+        </w:numPr>
+        <w:spacing w:before="240" w:beforeAutospacing="0" w:after="240" w:afterAutospacing="0"/>
+        <w:textAlignment w:val="baseline"/>
+        <w:rPr>
+          <w:rFonts w:asciiTheme="minorHAnsi" w:hAnsiTheme="minorHAnsi"/>
+          <w:b/>
+          <w:bCs/>
+          <w:color w:val="000000"/>
+        </w:rPr>
+      </w:pPr>
+      <w:r>
+        <w:rPr>
+          <w:rFonts w:asciiTheme="minorHAnsi" w:hAnsiTheme="minorHAnsi"/>
+          <w:b/>
+          <w:bCs/>
+          <w:color w:val="000000"/>
+          <w:shd w:val="clear" w:color="auto" w:fill="FFFFFF"/>
+        </w:rPr>
+        <w:t xml:space="preserve">RF02 – </w:t>
+      </w:r>
+      <w:proofErr w:type="spellStart"/>
+      <w:r>
+        <w:rPr>
+          <w:rFonts w:asciiTheme="minorHAnsi" w:hAnsiTheme="minorHAnsi"/>
+          <w:b/>
+          <w:bCs/>
+          <w:color w:val="000000"/>
+          <w:shd w:val="clear" w:color="auto" w:fill="FFFFFF"/>
+        </w:rPr>
+        <w:t>Consultar</w:t>
+      </w:r>
+      <w:proofErr w:type="spellEnd"/>
+      <w:r>
+        <w:rPr>
+          <w:rFonts w:asciiTheme="minorHAnsi" w:hAnsiTheme="minorHAnsi"/>
+          <w:b/>
+          <w:bCs/>
+          <w:color w:val="000000"/>
+          <w:shd w:val="clear" w:color="auto" w:fill="FFFFFF"/>
+        </w:rPr>
+        <w:t xml:space="preserve"> </w:t>
+      </w:r>
+      <w:proofErr w:type="spellStart"/>
+      <w:r>
+        <w:rPr>
+          <w:rFonts w:asciiTheme="minorHAnsi" w:hAnsiTheme="minorHAnsi"/>
+          <w:b/>
+          <w:bCs/>
+          <w:color w:val="000000"/>
+          <w:shd w:val="clear" w:color="auto" w:fill="FFFFFF"/>
+        </w:rPr>
+        <w:t>retiros</w:t>
+      </w:r>
+      <w:proofErr w:type="spellEnd"/>
+      <w:r>
+        <w:rPr>
+          <w:rFonts w:asciiTheme="minorHAnsi" w:hAnsiTheme="minorHAnsi"/>
+          <w:b/>
+          <w:bCs/>
+          <w:color w:val="000000"/>
+          <w:shd w:val="clear" w:color="auto" w:fill="FFFFFF"/>
+        </w:rPr>
+        <w:t xml:space="preserve"> </w:t>
+      </w:r>
+      <w:proofErr w:type="spellStart"/>
+      <w:r>
+        <w:rPr>
+          <w:rFonts w:asciiTheme="minorHAnsi" w:hAnsiTheme="minorHAnsi"/>
+          <w:b/>
+          <w:bCs/>
+          <w:color w:val="000000"/>
+          <w:shd w:val="clear" w:color="auto" w:fill="FFFFFF"/>
+        </w:rPr>
+        <w:t>registrados</w:t>
+      </w:r>
+      <w:proofErr w:type="spellEnd"/>
+    </w:p>
+    <w:p>
+      <w:pPr>
+        <w:pStyle w:val="NormalWeb"/>
+        <w:spacing w:before="240" w:beforeAutospacing="0" w:after="240" w:afterAutospacing="0"/>
+        <w:ind w:left="720"/>
+        <w:rPr>
+          <w:rFonts w:asciiTheme="minorHAnsi" w:hAnsiTheme="minorHAnsi"/>
+          <w:lang w:val="es-AR"/>
+        </w:rPr>
+      </w:pPr>
+      <w:r>
+        <w:rPr>
+          <w:rFonts w:asciiTheme="minorHAnsi" w:hAnsiTheme="minorHAnsi"/>
+          <w:color w:val="000000"/>
+          <w:shd w:val="clear" w:color="auto" w:fill="FFFFFF"/>
+          <w:lang w:val="es-AR"/>
+        </w:rPr>
+        <w:t>El sistema deberá permitir consultar los retiros registrados en el sistema.</w:t>
+      </w:r>
+    </w:p>
+    <w:p>
+      <w:pPr>
+        <w:pStyle w:val="NormalWeb"/>
+        <w:numPr>
+          <w:ilvl w:val="0"/>
+          <w:numId w:val="6"/>
+        </w:numPr>
+        <w:spacing w:before="240" w:beforeAutospacing="0" w:after="240" w:afterAutospacing="0"/>
+        <w:textAlignment w:val="baseline"/>
+        <w:rPr>
+          <w:rFonts w:asciiTheme="minorHAnsi" w:hAnsiTheme="minorHAnsi"/>
+          <w:b/>
+          <w:bCs/>
+          <w:color w:val="000000"/>
+        </w:rPr>
+      </w:pPr>
+      <w:r>
+        <w:rPr>
+          <w:rFonts w:asciiTheme="minorHAnsi" w:hAnsiTheme="minorHAnsi"/>
+          <w:b/>
+          <w:bCs/>
+          <w:color w:val="000000"/>
+          <w:shd w:val="clear" w:color="auto" w:fill="FFFFFF"/>
+        </w:rPr>
+        <w:t xml:space="preserve">RF03 – </w:t>
+      </w:r>
+      <w:proofErr w:type="spellStart"/>
+      <w:r>
+        <w:rPr>
+          <w:rFonts w:asciiTheme="minorHAnsi" w:hAnsiTheme="minorHAnsi"/>
+          <w:b/>
+          <w:bCs/>
+          <w:color w:val="000000"/>
+          <w:shd w:val="clear" w:color="auto" w:fill="FFFFFF"/>
+        </w:rPr>
+        <w:t>Modificar</w:t>
+      </w:r>
+      <w:proofErr w:type="spellEnd"/>
+      <w:r>
+        <w:rPr>
+          <w:rFonts w:asciiTheme="minorHAnsi" w:hAnsiTheme="minorHAnsi"/>
+          <w:b/>
+          <w:bCs/>
+          <w:color w:val="000000"/>
+          <w:shd w:val="clear" w:color="auto" w:fill="FFFFFF"/>
+        </w:rPr>
+        <w:t xml:space="preserve"> </w:t>
+      </w:r>
+      <w:proofErr w:type="spellStart"/>
+      <w:r>
+        <w:rPr>
+          <w:rFonts w:asciiTheme="minorHAnsi" w:hAnsiTheme="minorHAnsi"/>
+          <w:b/>
+          <w:bCs/>
+          <w:color w:val="000000"/>
+          <w:shd w:val="clear" w:color="auto" w:fill="FFFFFF"/>
+        </w:rPr>
+        <w:t>retiro</w:t>
+      </w:r>
+      <w:proofErr w:type="spellEnd"/>
+      <w:r>
+        <w:rPr>
+          <w:rFonts w:asciiTheme="minorHAnsi" w:hAnsiTheme="minorHAnsi"/>
+          <w:b/>
+          <w:bCs/>
+          <w:color w:val="000000"/>
+          <w:shd w:val="clear" w:color="auto" w:fill="FFFFFF"/>
+        </w:rPr>
+        <w:t xml:space="preserve"> </w:t>
+      </w:r>
+      <w:proofErr w:type="spellStart"/>
+      <w:r>
+        <w:rPr>
+          <w:rFonts w:asciiTheme="minorHAnsi" w:hAnsiTheme="minorHAnsi"/>
+          <w:b/>
+          <w:bCs/>
+          <w:color w:val="000000"/>
+          <w:shd w:val="clear" w:color="auto" w:fill="FFFFFF"/>
+        </w:rPr>
+        <w:t>agendado</w:t>
+      </w:r>
+      <w:proofErr w:type="spellEnd"/>
+    </w:p>
+    <w:p>
+      <w:pPr>
+        <w:pStyle w:val="NormalWeb"/>
+        <w:spacing w:before="240" w:beforeAutospacing="0" w:after="240" w:afterAutospacing="0"/>
+        <w:ind w:left="720"/>
+        <w:rPr>
+          <w:rFonts w:asciiTheme="minorHAnsi" w:hAnsiTheme="minorHAnsi"/>
+          <w:lang w:val="es-AR"/>
+        </w:rPr>
+      </w:pPr>
+      <w:r>
+        <w:rPr>
+          <w:rFonts w:asciiTheme="minorHAnsi" w:hAnsiTheme="minorHAnsi"/>
+          <w:color w:val="000000"/>
+          <w:shd w:val="clear" w:color="auto" w:fill="FFFFFF"/>
+          <w:lang w:val="es-AR"/>
+        </w:rPr>
+        <w:t xml:space="preserve">El sistema deberá permitir modificar la información de un retiro previamente </w:t>
+      </w:r>
+      <w:bookmarkStart w:id="0" w:name="_GoBack"/>
+      <w:bookmarkEnd w:id="0"/>
+      <w:r>
+        <w:rPr>
+          <w:rFonts w:asciiTheme="minorHAnsi" w:hAnsiTheme="minorHAnsi"/>
+          <w:color w:val="000000"/>
+          <w:shd w:val="clear" w:color="auto" w:fill="FFFFFF"/>
+          <w:lang w:val="es-AR"/>
+        </w:rPr>
+        <w:t>agendado.</w:t>
+      </w:r>
+    </w:p>
+    <w:p>
+      <w:pPr>
+        <w:pStyle w:val="NormalWeb"/>
+        <w:numPr>
+          <w:ilvl w:val="0"/>
+          <w:numId w:val="7"/>
+        </w:numPr>
+        <w:spacing w:before="240" w:beforeAutospacing="0" w:after="240" w:afterAutospacing="0"/>
+        <w:textAlignment w:val="baseline"/>
+        <w:rPr>
+          <w:rFonts w:asciiTheme="minorHAnsi" w:hAnsiTheme="minorHAnsi"/>
+          <w:b/>
+          <w:bCs/>
+          <w:color w:val="000000"/>
+        </w:rPr>
+      </w:pPr>
+      <w:r>
+        <w:rPr>
+          <w:rFonts w:asciiTheme="minorHAnsi" w:hAnsiTheme="minorHAnsi"/>
+          <w:b/>
+          <w:bCs/>
+          <w:color w:val="000000"/>
+          <w:shd w:val="clear" w:color="auto" w:fill="FFFFFF"/>
+        </w:rPr>
+        <w:t xml:space="preserve">RF04 – Dar de </w:t>
+      </w:r>
+      <w:proofErr w:type="spellStart"/>
+      <w:r>
+        <w:rPr>
+          <w:rFonts w:asciiTheme="minorHAnsi" w:hAnsiTheme="minorHAnsi"/>
+          <w:b/>
+          <w:bCs/>
+          <w:color w:val="000000"/>
+          <w:shd w:val="clear" w:color="auto" w:fill="FFFFFF"/>
+        </w:rPr>
+        <w:t>baja</w:t>
+      </w:r>
+      <w:proofErr w:type="spellEnd"/>
+      <w:r>
+        <w:rPr>
+          <w:rFonts w:asciiTheme="minorHAnsi" w:hAnsiTheme="minorHAnsi"/>
+          <w:b/>
+          <w:bCs/>
+          <w:color w:val="000000"/>
+          <w:shd w:val="clear" w:color="auto" w:fill="FFFFFF"/>
+        </w:rPr>
+        <w:t xml:space="preserve"> </w:t>
+      </w:r>
+      <w:proofErr w:type="spellStart"/>
+      <w:r>
+        <w:rPr>
+          <w:rFonts w:asciiTheme="minorHAnsi" w:hAnsiTheme="minorHAnsi"/>
+          <w:b/>
+          <w:bCs/>
+          <w:color w:val="000000"/>
+          <w:shd w:val="clear" w:color="auto" w:fill="FFFFFF"/>
+        </w:rPr>
+        <w:t>retiro</w:t>
+      </w:r>
+      <w:proofErr w:type="spellEnd"/>
+    </w:p>
+    <w:p>
+      <w:pPr>
+        <w:pStyle w:val="NormalWeb"/>
+        <w:spacing w:before="240" w:beforeAutospacing="0" w:after="240" w:afterAutospacing="0"/>
+        <w:ind w:left="720"/>
+        <w:rPr>
+          <w:rFonts w:asciiTheme="minorHAnsi" w:hAnsiTheme="minorHAnsi"/>
+          <w:lang w:val="es-AR"/>
+        </w:rPr>
+      </w:pPr>
+      <w:r>
+        <w:rPr>
+          <w:rFonts w:asciiTheme="minorHAnsi" w:hAnsiTheme="minorHAnsi"/>
+          <w:color w:val="000000"/>
+          <w:shd w:val="clear" w:color="auto" w:fill="FFFFFF"/>
+          <w:lang w:val="es-AR"/>
+        </w:rPr>
+        <w:t>El sistema deberá permitir dar de baja un retiro previamente registrado.</w:t>
+      </w:r>
+    </w:p>
+    <w:p>
+      <w:pPr>
+        <w:pStyle w:val="NormalWeb"/>
+        <w:numPr>
+          <w:ilvl w:val="0"/>
+          <w:numId w:val="8"/>
+        </w:numPr>
+        <w:spacing w:before="240" w:beforeAutospacing="0" w:after="240" w:afterAutospacing="0"/>
+        <w:textAlignment w:val="baseline"/>
+        <w:rPr>
+          <w:rFonts w:asciiTheme="minorHAnsi" w:hAnsiTheme="minorHAnsi"/>
+          <w:b/>
+          <w:bCs/>
+          <w:color w:val="000000"/>
+          <w:lang w:val="es-AR"/>
+        </w:rPr>
+      </w:pPr>
+      <w:r>
+        <w:rPr>
+          <w:rFonts w:asciiTheme="minorHAnsi" w:hAnsiTheme="minorHAnsi"/>
+          <w:b/>
+          <w:bCs/>
+          <w:color w:val="000000"/>
+          <w:shd w:val="clear" w:color="auto" w:fill="FFFFFF"/>
+          <w:lang w:val="es-AR"/>
+        </w:rPr>
+        <w:t>RF05 – Consultar retiros según criterios de búsqueda</w:t>
+      </w:r>
+    </w:p>
+    <w:p>
+      <w:pPr>
+        <w:pStyle w:val="NormalWeb"/>
+        <w:spacing w:before="240" w:beforeAutospacing="0" w:after="240" w:afterAutospacing="0"/>
+        <w:ind w:left="720"/>
+        <w:rPr>
+          <w:rFonts w:asciiTheme="minorHAnsi" w:hAnsiTheme="minorHAnsi"/>
+          <w:lang w:val="es-AR"/>
+        </w:rPr>
+      </w:pPr>
+      <w:r>
+        <w:rPr>
+          <w:rFonts w:asciiTheme="minorHAnsi" w:hAnsiTheme="minorHAnsi"/>
+          <w:color w:val="000000"/>
+          <w:shd w:val="clear" w:color="auto" w:fill="FFFFFF"/>
+          <w:lang w:val="es-AR"/>
+        </w:rPr>
+        <w:t>El sistema deberá permitir consultar retiros aplicando distintos criterios de búsqueda.</w:t>
+      </w:r>
+    </w:p>
+    <w:p>
+      <w:pPr>
+        <w:pStyle w:val="NormalWeb"/>
+        <w:numPr>
+          <w:ilvl w:val="0"/>
+          <w:numId w:val="9"/>
+        </w:numPr>
+        <w:spacing w:before="240" w:beforeAutospacing="0" w:after="240" w:afterAutospacing="0"/>
+        <w:textAlignment w:val="baseline"/>
+        <w:rPr>
+          <w:rFonts w:asciiTheme="minorHAnsi" w:hAnsiTheme="minorHAnsi"/>
+          <w:b/>
+          <w:bCs/>
+          <w:color w:val="000000"/>
+          <w:lang w:val="es-AR"/>
+        </w:rPr>
+      </w:pPr>
+      <w:r>
+        <w:rPr>
+          <w:rFonts w:asciiTheme="minorHAnsi" w:hAnsiTheme="minorHAnsi"/>
+          <w:b/>
+          <w:bCs/>
+          <w:color w:val="000000"/>
+          <w:shd w:val="clear" w:color="auto" w:fill="FFFFFF"/>
+          <w:lang w:val="es-AR"/>
+        </w:rPr>
+        <w:t>RF06 – Registrar actividades de un retiro</w:t>
+      </w:r>
+    </w:p>
+    <w:p>
+      <w:pPr>
+        <w:pStyle w:val="NormalWeb"/>
+        <w:spacing w:before="240" w:beforeAutospacing="0" w:after="240" w:afterAutospacing="0"/>
+        <w:ind w:left="720"/>
+        <w:rPr>
+          <w:rFonts w:asciiTheme="minorHAnsi" w:hAnsiTheme="minorHAnsi"/>
+          <w:lang w:val="es-AR"/>
+        </w:rPr>
+      </w:pPr>
+      <w:r>
+        <w:rPr>
+          <w:rFonts w:asciiTheme="minorHAnsi" w:hAnsiTheme="minorHAnsi"/>
+          <w:color w:val="000000"/>
+          <w:shd w:val="clear" w:color="auto" w:fill="FFFFFF"/>
+          <w:lang w:val="es-AR"/>
+        </w:rPr>
+        <w:t>El sistema deberá permitir registrar las actividades involucradas en un retiro.</w:t>
+      </w:r>
+    </w:p>
+    <w:p>
+      <w:pPr>
+        <w:pStyle w:val="NormalWeb"/>
+        <w:numPr>
+          <w:ilvl w:val="0"/>
+          <w:numId w:val="10"/>
+        </w:numPr>
+        <w:spacing w:before="240" w:beforeAutospacing="0" w:after="240" w:afterAutospacing="0"/>
+        <w:textAlignment w:val="baseline"/>
+        <w:rPr>
+          <w:rFonts w:asciiTheme="minorHAnsi" w:hAnsiTheme="minorHAnsi"/>
+          <w:b/>
+          <w:bCs/>
+          <w:color w:val="000000"/>
+          <w:lang w:val="es-AR"/>
+        </w:rPr>
+      </w:pPr>
+      <w:r>
+        <w:rPr>
+          <w:rFonts w:asciiTheme="minorHAnsi" w:hAnsiTheme="minorHAnsi"/>
+          <w:b/>
+          <w:bCs/>
+          <w:color w:val="000000"/>
+          <w:shd w:val="clear" w:color="auto" w:fill="FFFFFF"/>
+          <w:lang w:val="es-AR"/>
+        </w:rPr>
+        <w:t>RF07 – Compartir información de un retiro</w:t>
+      </w:r>
+    </w:p>
+    <w:p>
+      <w:pPr>
+        <w:pStyle w:val="NormalWeb"/>
+        <w:spacing w:before="240" w:beforeAutospacing="0" w:after="240" w:afterAutospacing="0"/>
+        <w:ind w:left="720"/>
+        <w:rPr>
+          <w:rFonts w:asciiTheme="minorHAnsi" w:hAnsiTheme="minorHAnsi"/>
+          <w:lang w:val="es-AR"/>
+        </w:rPr>
+      </w:pPr>
+      <w:r>
+        <w:rPr>
+          <w:rFonts w:asciiTheme="minorHAnsi" w:hAnsiTheme="minorHAnsi"/>
+          <w:color w:val="000000"/>
+          <w:shd w:val="clear" w:color="auto" w:fill="FFFFFF"/>
+          <w:lang w:val="es-AR"/>
+        </w:rPr>
+        <w:t>El sistema deberá permitir compartir información de un retiro con otros usuarios mediante medios externos.</w:t>
+      </w:r>
+    </w:p>
+    <w:p>
+      <w:pPr>
+        <w:pStyle w:val="NormalWeb"/>
+        <w:numPr>
+          <w:ilvl w:val="0"/>
+          <w:numId w:val="11"/>
+        </w:numPr>
+        <w:spacing w:before="240" w:beforeAutospacing="0" w:after="240" w:afterAutospacing="0"/>
+        <w:textAlignment w:val="baseline"/>
+        <w:rPr>
+          <w:rFonts w:asciiTheme="minorHAnsi" w:hAnsiTheme="minorHAnsi"/>
+          <w:b/>
+          <w:bCs/>
+          <w:color w:val="000000"/>
+        </w:rPr>
+      </w:pPr>
+      <w:r>
+        <w:rPr>
+          <w:rFonts w:asciiTheme="minorHAnsi" w:hAnsiTheme="minorHAnsi"/>
+          <w:b/>
+          <w:bCs/>
+          <w:color w:val="000000"/>
+          <w:shd w:val="clear" w:color="auto" w:fill="FFFFFF"/>
+        </w:rPr>
+        <w:t xml:space="preserve">RF08 – Registrar </w:t>
+      </w:r>
+      <w:proofErr w:type="spellStart"/>
+      <w:r>
+        <w:rPr>
+          <w:rFonts w:asciiTheme="minorHAnsi" w:hAnsiTheme="minorHAnsi"/>
+          <w:b/>
+          <w:bCs/>
+          <w:color w:val="000000"/>
+          <w:shd w:val="clear" w:color="auto" w:fill="FFFFFF"/>
+        </w:rPr>
+        <w:t>pago</w:t>
+      </w:r>
+      <w:proofErr w:type="spellEnd"/>
+      <w:r>
+        <w:rPr>
+          <w:rFonts w:asciiTheme="minorHAnsi" w:hAnsiTheme="minorHAnsi"/>
+          <w:b/>
+          <w:bCs/>
+          <w:color w:val="000000"/>
+          <w:shd w:val="clear" w:color="auto" w:fill="FFFFFF"/>
+        </w:rPr>
+        <w:t> </w:t>
+      </w:r>
+    </w:p>
+    <w:p>
+      <w:pPr>
+        <w:pStyle w:val="NormalWeb"/>
+        <w:spacing w:before="240" w:beforeAutospacing="0" w:after="240" w:afterAutospacing="0"/>
+        <w:ind w:left="720"/>
+        <w:rPr>
+          <w:rFonts w:asciiTheme="minorHAnsi" w:hAnsiTheme="minorHAnsi"/>
+          <w:lang w:val="es-AR"/>
+        </w:rPr>
+      </w:pPr>
+      <w:r>
+        <w:rPr>
+          <w:rFonts w:asciiTheme="minorHAnsi" w:hAnsiTheme="minorHAnsi"/>
+          <w:color w:val="000000"/>
+          <w:shd w:val="clear" w:color="auto" w:fill="FFFFFF"/>
+          <w:lang w:val="es-AR"/>
+        </w:rPr>
+        <w:t>El sistema deberá permitir registrar un nuevo pago indicando estado, total, fecha y método.</w:t>
+      </w:r>
+    </w:p>
+    <w:p>
+      <w:pPr>
+        <w:pStyle w:val="NormalWeb"/>
+        <w:numPr>
+          <w:ilvl w:val="0"/>
+          <w:numId w:val="12"/>
+        </w:numPr>
+        <w:spacing w:before="240" w:beforeAutospacing="0" w:after="240" w:afterAutospacing="0"/>
+        <w:textAlignment w:val="baseline"/>
+        <w:rPr>
+          <w:rFonts w:asciiTheme="minorHAnsi" w:hAnsiTheme="minorHAnsi"/>
+          <w:b/>
+          <w:bCs/>
+          <w:color w:val="000000"/>
+        </w:rPr>
+      </w:pPr>
+      <w:r>
+        <w:rPr>
+          <w:rFonts w:asciiTheme="minorHAnsi" w:hAnsiTheme="minorHAnsi"/>
+          <w:b/>
+          <w:bCs/>
+          <w:color w:val="000000"/>
+          <w:shd w:val="clear" w:color="auto" w:fill="FFFFFF"/>
+        </w:rPr>
+        <w:t xml:space="preserve">RF09 – </w:t>
+      </w:r>
+      <w:proofErr w:type="spellStart"/>
+      <w:r>
+        <w:rPr>
+          <w:rFonts w:asciiTheme="minorHAnsi" w:hAnsiTheme="minorHAnsi"/>
+          <w:b/>
+          <w:bCs/>
+          <w:color w:val="000000"/>
+          <w:shd w:val="clear" w:color="auto" w:fill="FFFFFF"/>
+        </w:rPr>
+        <w:t>Consultar</w:t>
+      </w:r>
+      <w:proofErr w:type="spellEnd"/>
+      <w:r>
+        <w:rPr>
+          <w:rFonts w:asciiTheme="minorHAnsi" w:hAnsiTheme="minorHAnsi"/>
+          <w:b/>
+          <w:bCs/>
+          <w:color w:val="000000"/>
+          <w:shd w:val="clear" w:color="auto" w:fill="FFFFFF"/>
+        </w:rPr>
+        <w:t xml:space="preserve"> </w:t>
+      </w:r>
+      <w:proofErr w:type="spellStart"/>
+      <w:r>
+        <w:rPr>
+          <w:rFonts w:asciiTheme="minorHAnsi" w:hAnsiTheme="minorHAnsi"/>
+          <w:b/>
+          <w:bCs/>
+          <w:color w:val="000000"/>
+          <w:shd w:val="clear" w:color="auto" w:fill="FFFFFF"/>
+        </w:rPr>
+        <w:t>pagos</w:t>
+      </w:r>
+      <w:proofErr w:type="spellEnd"/>
+      <w:r>
+        <w:rPr>
+          <w:rFonts w:asciiTheme="minorHAnsi" w:hAnsiTheme="minorHAnsi"/>
+          <w:b/>
+          <w:bCs/>
+          <w:color w:val="000000"/>
+          <w:shd w:val="clear" w:color="auto" w:fill="FFFFFF"/>
+        </w:rPr>
+        <w:t xml:space="preserve"> </w:t>
+      </w:r>
+      <w:proofErr w:type="spellStart"/>
+      <w:r>
+        <w:rPr>
+          <w:rFonts w:asciiTheme="minorHAnsi" w:hAnsiTheme="minorHAnsi"/>
+          <w:b/>
+          <w:bCs/>
+          <w:color w:val="000000"/>
+          <w:shd w:val="clear" w:color="auto" w:fill="FFFFFF"/>
+        </w:rPr>
+        <w:t>realizados</w:t>
+      </w:r>
+      <w:proofErr w:type="spellEnd"/>
+    </w:p>
+    <w:p>
+      <w:pPr>
+        <w:pStyle w:val="NormalWeb"/>
+        <w:spacing w:before="240" w:beforeAutospacing="0" w:after="240" w:afterAutospacing="0"/>
+        <w:ind w:left="720"/>
+        <w:rPr>
+          <w:rFonts w:asciiTheme="minorHAnsi" w:hAnsiTheme="minorHAnsi"/>
+          <w:lang w:val="es-AR"/>
+        </w:rPr>
+      </w:pPr>
+      <w:r>
+        <w:rPr>
+          <w:rFonts w:asciiTheme="minorHAnsi" w:hAnsiTheme="minorHAnsi"/>
+          <w:color w:val="000000"/>
+          <w:shd w:val="clear" w:color="auto" w:fill="FFFFFF"/>
+          <w:lang w:val="es-AR"/>
+        </w:rPr>
+        <w:t>El sistema deberá permitir consultar los pagos previamente realizados en el sistema.</w:t>
+      </w:r>
+    </w:p>
+    <w:p>
+      <w:pPr>
+        <w:pStyle w:val="NormalWeb"/>
+        <w:numPr>
+          <w:ilvl w:val="0"/>
+          <w:numId w:val="13"/>
+        </w:numPr>
+        <w:spacing w:before="240" w:beforeAutospacing="0" w:after="240" w:afterAutospacing="0"/>
+        <w:textAlignment w:val="baseline"/>
+        <w:rPr>
+          <w:rFonts w:asciiTheme="minorHAnsi" w:hAnsiTheme="minorHAnsi"/>
+          <w:b/>
+          <w:bCs/>
+          <w:color w:val="000000"/>
+        </w:rPr>
+      </w:pPr>
+      <w:r>
+        <w:rPr>
+          <w:rFonts w:asciiTheme="minorHAnsi" w:hAnsiTheme="minorHAnsi"/>
+          <w:b/>
+          <w:bCs/>
+          <w:color w:val="000000"/>
+          <w:shd w:val="clear" w:color="auto" w:fill="FFFFFF"/>
+        </w:rPr>
+        <w:t xml:space="preserve">RF10 – </w:t>
+      </w:r>
+      <w:proofErr w:type="spellStart"/>
+      <w:r>
+        <w:rPr>
+          <w:rFonts w:asciiTheme="minorHAnsi" w:hAnsiTheme="minorHAnsi"/>
+          <w:b/>
+          <w:bCs/>
+          <w:color w:val="000000"/>
+          <w:shd w:val="clear" w:color="auto" w:fill="FFFFFF"/>
+        </w:rPr>
+        <w:t>Calcular</w:t>
+      </w:r>
+      <w:proofErr w:type="spellEnd"/>
+      <w:r>
+        <w:rPr>
+          <w:rFonts w:asciiTheme="minorHAnsi" w:hAnsiTheme="minorHAnsi"/>
+          <w:b/>
+          <w:bCs/>
+          <w:color w:val="000000"/>
+          <w:shd w:val="clear" w:color="auto" w:fill="FFFFFF"/>
+        </w:rPr>
+        <w:t xml:space="preserve"> </w:t>
+      </w:r>
+      <w:proofErr w:type="spellStart"/>
+      <w:r>
+        <w:rPr>
+          <w:rFonts w:asciiTheme="minorHAnsi" w:hAnsiTheme="minorHAnsi"/>
+          <w:b/>
+          <w:bCs/>
+          <w:color w:val="000000"/>
+          <w:shd w:val="clear" w:color="auto" w:fill="FFFFFF"/>
+        </w:rPr>
+        <w:t>gastos</w:t>
+      </w:r>
+      <w:proofErr w:type="spellEnd"/>
+      <w:r>
+        <w:rPr>
+          <w:rFonts w:asciiTheme="minorHAnsi" w:hAnsiTheme="minorHAnsi"/>
+          <w:b/>
+          <w:bCs/>
+          <w:color w:val="000000"/>
+          <w:shd w:val="clear" w:color="auto" w:fill="FFFFFF"/>
+        </w:rPr>
+        <w:t xml:space="preserve"> </w:t>
+      </w:r>
+      <w:proofErr w:type="spellStart"/>
+      <w:r>
+        <w:rPr>
+          <w:rFonts w:asciiTheme="minorHAnsi" w:hAnsiTheme="minorHAnsi"/>
+          <w:b/>
+          <w:bCs/>
+          <w:color w:val="000000"/>
+          <w:shd w:val="clear" w:color="auto" w:fill="FFFFFF"/>
+        </w:rPr>
+        <w:t>por</w:t>
+      </w:r>
+      <w:proofErr w:type="spellEnd"/>
+      <w:r>
+        <w:rPr>
+          <w:rFonts w:asciiTheme="minorHAnsi" w:hAnsiTheme="minorHAnsi"/>
+          <w:b/>
+          <w:bCs/>
+          <w:color w:val="000000"/>
+          <w:shd w:val="clear" w:color="auto" w:fill="FFFFFF"/>
+        </w:rPr>
+        <w:t xml:space="preserve"> </w:t>
+      </w:r>
+      <w:proofErr w:type="spellStart"/>
+      <w:r>
+        <w:rPr>
+          <w:rFonts w:asciiTheme="minorHAnsi" w:hAnsiTheme="minorHAnsi"/>
+          <w:b/>
+          <w:bCs/>
+          <w:color w:val="000000"/>
+          <w:shd w:val="clear" w:color="auto" w:fill="FFFFFF"/>
+        </w:rPr>
+        <w:t>período</w:t>
+      </w:r>
+      <w:proofErr w:type="spellEnd"/>
+    </w:p>
+    <w:p>
+      <w:pPr>
+        <w:pStyle w:val="NormalWeb"/>
+        <w:spacing w:before="240" w:beforeAutospacing="0" w:after="240" w:afterAutospacing="0"/>
+        <w:ind w:left="720"/>
+        <w:rPr>
+          <w:rFonts w:asciiTheme="minorHAnsi" w:hAnsiTheme="minorHAnsi"/>
+          <w:lang w:val="es-AR"/>
+        </w:rPr>
+      </w:pPr>
+      <w:r>
+        <w:rPr>
+          <w:rFonts w:asciiTheme="minorHAnsi" w:hAnsiTheme="minorHAnsi"/>
+          <w:color w:val="000000"/>
+          <w:shd w:val="clear" w:color="auto" w:fill="FFFFFF"/>
+          <w:lang w:val="es-AR"/>
+        </w:rPr>
+        <w:lastRenderedPageBreak/>
+        <w:t>El sistema deberá permitir calcular el total de los gastos registrados en el sistema.</w:t>
+      </w:r>
+    </w:p>
+    <w:p>
+      <w:pPr>
+        <w:pStyle w:val="NormalWeb"/>
+        <w:numPr>
+          <w:ilvl w:val="0"/>
+          <w:numId w:val="14"/>
+        </w:numPr>
+        <w:spacing w:before="240" w:beforeAutospacing="0" w:after="240" w:afterAutospacing="0"/>
+        <w:textAlignment w:val="baseline"/>
+        <w:rPr>
+          <w:rFonts w:asciiTheme="minorHAnsi" w:hAnsiTheme="minorHAnsi"/>
+          <w:b/>
+          <w:bCs/>
+          <w:color w:val="000000"/>
+          <w:lang w:val="es-AR"/>
+        </w:rPr>
+      </w:pPr>
+      <w:r>
+        <w:rPr>
+          <w:rFonts w:asciiTheme="minorHAnsi" w:hAnsiTheme="minorHAnsi"/>
+          <w:b/>
+          <w:bCs/>
+          <w:color w:val="000000"/>
+          <w:shd w:val="clear" w:color="auto" w:fill="FFFFFF"/>
+          <w:lang w:val="es-AR"/>
+        </w:rPr>
+        <w:t>RF11 – Consultar gastos según criterios de búsqueda</w:t>
+      </w:r>
+    </w:p>
+    <w:p>
+      <w:pPr>
+        <w:pStyle w:val="NormalWeb"/>
+        <w:spacing w:before="240" w:beforeAutospacing="0" w:after="240" w:afterAutospacing="0"/>
+        <w:ind w:left="720"/>
+        <w:rPr>
+          <w:rFonts w:asciiTheme="minorHAnsi" w:hAnsiTheme="minorHAnsi"/>
+          <w:lang w:val="es-AR"/>
+        </w:rPr>
+      </w:pPr>
+      <w:r>
+        <w:rPr>
+          <w:rFonts w:asciiTheme="minorHAnsi" w:hAnsiTheme="minorHAnsi"/>
+          <w:color w:val="000000"/>
+          <w:shd w:val="clear" w:color="auto" w:fill="FFFFFF"/>
+          <w:lang w:val="es-AR"/>
+        </w:rPr>
+        <w:t>El sistema deberá permitir consultar los gastos registrados en el sistema aplicando distintos criterios de búsqueda.</w:t>
+      </w:r>
+    </w:p>
     <w:p/>
     <w:p/>
     <w:p>
@@ -590,9 +1451,357 @@
 </w:document>
 </file>
 
+<file path=word/endnotes.xml><?xml version="1.0" encoding="utf-8"?>
+<w:endnotes xmlns:wpc="http://schemas.microsoft.com/office/word/2010/wordprocessingCanvas" xmlns:cx="http://schemas.microsoft.com/office/drawing/2014/chartex" xmlns:mc="http://schemas.openxmlformats.org/markup-compatibility/2006" xmlns:o="urn:schemas-microsoft-com:office:office" xmlns:r="http://schemas.openxmlformats.org/officeDocument/2006/relationships" xmlns:m="http://schemas.openxmlformats.org/officeDocument/2006/math" xmlns:v="urn:schemas-microsoft-com:vml" xmlns:wp14="http://schemas.microsoft.com/office/word/2010/wordprocessingDrawing" xmlns:wp="http://schemas.openxmlformats.org/drawingml/2006/wordprocessingDrawing" xmlns:w10="urn:schemas-microsoft-com:office:word" xmlns:w="http://schemas.openxmlformats.org/wordprocessingml/2006/main" xmlns:w14="http://schemas.microsoft.com/office/word/2010/wordml" xmlns:w15="http://schemas.microsoft.com/office/word/2012/wordml" xmlns:w16se="http://schemas.microsoft.com/office/word/2015/wordml/symex" xmlns:wpg="http://schemas.microsoft.com/office/word/2010/wordprocessingGroup" xmlns:wpi="http://schemas.microsoft.com/office/word/2010/wordprocessingInk" xmlns:wne="http://schemas.microsoft.com/office/word/2006/wordml" xmlns:wps="http://schemas.microsoft.com/office/word/2010/wordprocessingShape" mc:Ignorable="w14 w15 w16se wp14">
+  <w:endnote w:type="separator" w:id="-1">
+    <w:p>
+      <w:pPr>
+        <w:spacing w:after="0" w:line="240" w:lineRule="auto"/>
+      </w:pPr>
+      <w:r>
+        <w:separator/>
+      </w:r>
+    </w:p>
+  </w:endnote>
+  <w:endnote w:type="continuationSeparator" w:id="0">
+    <w:p>
+      <w:pPr>
+        <w:spacing w:after="0" w:line="240" w:lineRule="auto"/>
+      </w:pPr>
+      <w:r>
+        <w:continuationSeparator/>
+      </w:r>
+    </w:p>
+  </w:endnote>
+</w:endnotes>
+</file>
+
+<file path=word/footnotes.xml><?xml version="1.0" encoding="utf-8"?>
+<w:footnotes xmlns:wpc="http://schemas.microsoft.com/office/word/2010/wordprocessingCanvas" xmlns:cx="http://schemas.microsoft.com/office/drawing/2014/chartex" xmlns:mc="http://schemas.openxmlformats.org/markup-compatibility/2006" xmlns:o="urn:schemas-microsoft-com:office:office" xmlns:r="http://schemas.openxmlformats.org/officeDocument/2006/relationships" xmlns:m="http://schemas.openxmlformats.org/officeDocument/2006/math" xmlns:v="urn:schemas-microsoft-com:vml" xmlns:wp14="http://schemas.microsoft.com/office/word/2010/wordprocessingDrawing" xmlns:wp="http://schemas.openxmlformats.org/drawingml/2006/wordprocessingDrawing" xmlns:w10="urn:schemas-microsoft-com:office:word" xmlns:w="http://schemas.openxmlformats.org/wordprocessingml/2006/main" xmlns:w14="http://schemas.microsoft.com/office/word/2010/wordml" xmlns:w15="http://schemas.microsoft.com/office/word/2012/wordml" xmlns:w16se="http://schemas.microsoft.com/office/word/2015/wordml/symex" xmlns:wpg="http://schemas.microsoft.com/office/word/2010/wordprocessingGroup" xmlns:wpi="http://schemas.microsoft.com/office/word/2010/wordprocessingInk" xmlns:wne="http://schemas.microsoft.com/office/word/2006/wordml" xmlns:wps="http://schemas.microsoft.com/office/word/2010/wordprocessingShape" mc:Ignorable="w14 w15 w16se wp14">
+  <w:footnote w:type="separator" w:id="-1">
+    <w:p>
+      <w:pPr>
+        <w:spacing w:after="0" w:line="240" w:lineRule="auto"/>
+      </w:pPr>
+      <w:r>
+        <w:separator/>
+      </w:r>
+    </w:p>
+  </w:footnote>
+  <w:footnote w:type="continuationSeparator" w:id="0">
+    <w:p>
+      <w:pPr>
+        <w:spacing w:after="0" w:line="240" w:lineRule="auto"/>
+      </w:pPr>
+      <w:r>
+        <w:continuationSeparator/>
+      </w:r>
+    </w:p>
+  </w:footnote>
+</w:footnotes>
+</file>
+
 <file path=word/numbering.xml><?xml version="1.0" encoding="utf-8"?>
-<w:numbering xmlns:wpc="http://schemas.microsoft.com/office/word/2010/wordprocessingCanvas" xmlns:cx="http://schemas.microsoft.com/office/drawing/2014/chartex" xmlns:cx1="http://schemas.microsoft.com/office/drawing/2015/9/8/chartex" xmlns:cx2="http://schemas.microsoft.com/office/drawing/2015/10/21/chartex" xmlns:cx3="http://schemas.microsoft.com/office/drawing/2016/5/9/chartex" xmlns:cx4="http://schemas.microsoft.com/office/drawing/2016/5/10/chartex" xmlns:cx5="http://schemas.microsoft.com/office/drawing/2016/5/11/chartex" xmlns:cx6="http://schemas.microsoft.com/office/drawing/2016/5/12/chartex" xmlns:cx7="http://schemas.microsoft.com/office/drawing/2016/5/13/chartex" xmlns:cx8="http://schemas.microsoft.com/office/drawing/2016/5/14/chartex" xmlns:mc="http://schemas.openxmlformats.org/markup-compatibility/2006" xmlns:aink="http://schemas.microsoft.com/office/drawing/2016/ink" xmlns:am3d="http://schemas.microsoft.com/office/drawing/2017/model3d" xmlns:o="urn:schemas-microsoft-com:office:office" xmlns:oel="http://schemas.microsoft.com/office/2019/extlst" xmlns:r="http://schemas.openxmlformats.org/officeDocument/2006/relationships" xmlns:m="http://schemas.openxmlformats.org/officeDocument/2006/math" xmlns:v="urn:schemas-microsoft-com:vml" xmlns:wp14="http://schemas.microsoft.com/office/word/2010/wordprocessingDrawing" xmlns:wp="http://schemas.openxmlformats.org/drawingml/2006/wordprocessingDrawing" xmlns:w10="urn:schemas-microsoft-com:office:word" xmlns:w="http://schemas.openxmlformats.org/wordprocessingml/2006/main" xmlns:w14="http://schemas.microsoft.com/office/word/2010/wordml" xmlns:w15="http://schemas.microsoft.com/office/word/2012/wordml" xmlns:w16cex="http://schemas.microsoft.com/office/word/2018/wordml/cex" xmlns:w16cid="http://schemas.microsoft.com/office/word/2016/wordml/cid" xmlns:w16="http://schemas.microsoft.com/office/word/2018/wordml" xmlns:w16du="http://schemas.microsoft.com/office/word/2023/wordml/word16du" xmlns:w16sdtdh="http://schemas.microsoft.com/office/word/2020/wordml/sdtdatahash" xmlns:w16sdtfl="http://schemas.microsoft.com/office/word/2024/wordml/sdtformatlock" xmlns:w16se="http://schemas.microsoft.com/office/word/2015/wordml/symex" xmlns:wpg="http://schemas.microsoft.com/office/word/2010/wordprocessingGroup" xmlns:wpi="http://schemas.microsoft.com/office/word/2010/wordprocessingInk" xmlns:wne="http://schemas.microsoft.com/office/word/2006/wordml" xmlns:wps="http://schemas.microsoft.com/office/word/2010/wordprocessingShape" mc:Ignorable="w14 w15 w16se w16cid w16 w16cex w16sdtdh w16sdtfl w16du wp14">
+<w:numbering xmlns:wpc="http://schemas.microsoft.com/office/word/2010/wordprocessingCanvas" xmlns:cx="http://schemas.microsoft.com/office/drawing/2014/chartex" xmlns:mc="http://schemas.openxmlformats.org/markup-compatibility/2006" xmlns:o="urn:schemas-microsoft-com:office:office" xmlns:r="http://schemas.openxmlformats.org/officeDocument/2006/relationships" xmlns:m="http://schemas.openxmlformats.org/officeDocument/2006/math" xmlns:v="urn:schemas-microsoft-com:vml" xmlns:wp14="http://schemas.microsoft.com/office/word/2010/wordprocessingDrawing" xmlns:wp="http://schemas.openxmlformats.org/drawingml/2006/wordprocessingDrawing" xmlns:w10="urn:schemas-microsoft-com:office:word" xmlns:w="http://schemas.openxmlformats.org/wordprocessingml/2006/main" xmlns:w14="http://schemas.microsoft.com/office/word/2010/wordml" xmlns:w15="http://schemas.microsoft.com/office/word/2012/wordml" xmlns:w16se="http://schemas.microsoft.com/office/word/2015/wordml/symex" xmlns:wpg="http://schemas.microsoft.com/office/word/2010/wordprocessingGroup" xmlns:wpi="http://schemas.microsoft.com/office/word/2010/wordprocessingInk" xmlns:wne="http://schemas.microsoft.com/office/word/2006/wordml" xmlns:wps="http://schemas.microsoft.com/office/word/2010/wordprocessingShape" mc:Ignorable="w14 w15 w16se wp14">
   <w:abstractNum w:abstractNumId="0" w15:restartNumberingAfterBreak="0">
+    <w:nsid w:val="1BD26D3B"/>
+    <w:multiLevelType w:val="multilevel"/>
+    <w:tmpl w:val="8C00877C"/>
+    <w:lvl w:ilvl="0">
+      <w:start w:val="1"/>
+      <w:numFmt w:val="bullet"/>
+      <w:lvlText w:val=""/>
+      <w:lvlJc w:val="left"/>
+      <w:pPr>
+        <w:tabs>
+          <w:tab w:val="num" w:pos="720"/>
+        </w:tabs>
+        <w:ind w:left="720" w:hanging="360"/>
+      </w:pPr>
+      <w:rPr>
+        <w:rFonts w:ascii="Symbol" w:hAnsi="Symbol" w:hint="default"/>
+        <w:sz w:val="20"/>
+      </w:rPr>
+    </w:lvl>
+    <w:lvl w:ilvl="1" w:tentative="1">
+      <w:start w:val="1"/>
+      <w:numFmt w:val="bullet"/>
+      <w:lvlText w:val="o"/>
+      <w:lvlJc w:val="left"/>
+      <w:pPr>
+        <w:tabs>
+          <w:tab w:val="num" w:pos="1440"/>
+        </w:tabs>
+        <w:ind w:left="1440" w:hanging="360"/>
+      </w:pPr>
+      <w:rPr>
+        <w:rFonts w:ascii="Courier New" w:hAnsi="Courier New" w:hint="default"/>
+        <w:sz w:val="20"/>
+      </w:rPr>
+    </w:lvl>
+    <w:lvl w:ilvl="2" w:tentative="1">
+      <w:start w:val="1"/>
+      <w:numFmt w:val="bullet"/>
+      <w:lvlText w:val=""/>
+      <w:lvlJc w:val="left"/>
+      <w:pPr>
+        <w:tabs>
+          <w:tab w:val="num" w:pos="2160"/>
+        </w:tabs>
+        <w:ind w:left="2160" w:hanging="360"/>
+      </w:pPr>
+      <w:rPr>
+        <w:rFonts w:ascii="Wingdings" w:hAnsi="Wingdings" w:hint="default"/>
+        <w:sz w:val="20"/>
+      </w:rPr>
+    </w:lvl>
+    <w:lvl w:ilvl="3" w:tentative="1">
+      <w:start w:val="1"/>
+      <w:numFmt w:val="bullet"/>
+      <w:lvlText w:val=""/>
+      <w:lvlJc w:val="left"/>
+      <w:pPr>
+        <w:tabs>
+          <w:tab w:val="num" w:pos="2880"/>
+        </w:tabs>
+        <w:ind w:left="2880" w:hanging="360"/>
+      </w:pPr>
+      <w:rPr>
+        <w:rFonts w:ascii="Wingdings" w:hAnsi="Wingdings" w:hint="default"/>
+        <w:sz w:val="20"/>
+      </w:rPr>
+    </w:lvl>
+    <w:lvl w:ilvl="4" w:tentative="1">
+      <w:start w:val="1"/>
+      <w:numFmt w:val="bullet"/>
+      <w:lvlText w:val=""/>
+      <w:lvlJc w:val="left"/>
+      <w:pPr>
+        <w:tabs>
+          <w:tab w:val="num" w:pos="3600"/>
+        </w:tabs>
+        <w:ind w:left="3600" w:hanging="360"/>
+      </w:pPr>
+      <w:rPr>
+        <w:rFonts w:ascii="Wingdings" w:hAnsi="Wingdings" w:hint="default"/>
+        <w:sz w:val="20"/>
+      </w:rPr>
+    </w:lvl>
+    <w:lvl w:ilvl="5" w:tentative="1">
+      <w:start w:val="1"/>
+      <w:numFmt w:val="bullet"/>
+      <w:lvlText w:val=""/>
+      <w:lvlJc w:val="left"/>
+      <w:pPr>
+        <w:tabs>
+          <w:tab w:val="num" w:pos="4320"/>
+        </w:tabs>
+        <w:ind w:left="4320" w:hanging="360"/>
+      </w:pPr>
+      <w:rPr>
+        <w:rFonts w:ascii="Wingdings" w:hAnsi="Wingdings" w:hint="default"/>
+        <w:sz w:val="20"/>
+      </w:rPr>
+    </w:lvl>
+    <w:lvl w:ilvl="6" w:tentative="1">
+      <w:start w:val="1"/>
+      <w:numFmt w:val="bullet"/>
+      <w:lvlText w:val=""/>
+      <w:lvlJc w:val="left"/>
+      <w:pPr>
+        <w:tabs>
+          <w:tab w:val="num" w:pos="5040"/>
+        </w:tabs>
+        <w:ind w:left="5040" w:hanging="360"/>
+      </w:pPr>
+      <w:rPr>
+        <w:rFonts w:ascii="Wingdings" w:hAnsi="Wingdings" w:hint="default"/>
+        <w:sz w:val="20"/>
+      </w:rPr>
+    </w:lvl>
+    <w:lvl w:ilvl="7" w:tentative="1">
+      <w:start w:val="1"/>
+      <w:numFmt w:val="bullet"/>
+      <w:lvlText w:val=""/>
+      <w:lvlJc w:val="left"/>
+      <w:pPr>
+        <w:tabs>
+          <w:tab w:val="num" w:pos="5760"/>
+        </w:tabs>
+        <w:ind w:left="5760" w:hanging="360"/>
+      </w:pPr>
+      <w:rPr>
+        <w:rFonts w:ascii="Wingdings" w:hAnsi="Wingdings" w:hint="default"/>
+        <w:sz w:val="20"/>
+      </w:rPr>
+    </w:lvl>
+    <w:lvl w:ilvl="8" w:tentative="1">
+      <w:start w:val="1"/>
+      <w:numFmt w:val="bullet"/>
+      <w:lvlText w:val=""/>
+      <w:lvlJc w:val="left"/>
+      <w:pPr>
+        <w:tabs>
+          <w:tab w:val="num" w:pos="6480"/>
+        </w:tabs>
+        <w:ind w:left="6480" w:hanging="360"/>
+      </w:pPr>
+      <w:rPr>
+        <w:rFonts w:ascii="Wingdings" w:hAnsi="Wingdings" w:hint="default"/>
+        <w:sz w:val="20"/>
+      </w:rPr>
+    </w:lvl>
+  </w:abstractNum>
+  <w:abstractNum w:abstractNumId="1" w15:restartNumberingAfterBreak="0">
+    <w:nsid w:val="1D6D0D83"/>
+    <w:multiLevelType w:val="multilevel"/>
+    <w:tmpl w:val="12C0D588"/>
+    <w:lvl w:ilvl="0">
+      <w:start w:val="1"/>
+      <w:numFmt w:val="bullet"/>
+      <w:lvlText w:val=""/>
+      <w:lvlJc w:val="left"/>
+      <w:pPr>
+        <w:tabs>
+          <w:tab w:val="num" w:pos="720"/>
+        </w:tabs>
+        <w:ind w:left="720" w:hanging="360"/>
+      </w:pPr>
+      <w:rPr>
+        <w:rFonts w:ascii="Symbol" w:hAnsi="Symbol" w:hint="default"/>
+        <w:sz w:val="20"/>
+      </w:rPr>
+    </w:lvl>
+    <w:lvl w:ilvl="1" w:tentative="1">
+      <w:start w:val="1"/>
+      <w:numFmt w:val="bullet"/>
+      <w:lvlText w:val="o"/>
+      <w:lvlJc w:val="left"/>
+      <w:pPr>
+        <w:tabs>
+          <w:tab w:val="num" w:pos="1440"/>
+        </w:tabs>
+        <w:ind w:left="1440" w:hanging="360"/>
+      </w:pPr>
+      <w:rPr>
+        <w:rFonts w:ascii="Courier New" w:hAnsi="Courier New" w:hint="default"/>
+        <w:sz w:val="20"/>
+      </w:rPr>
+    </w:lvl>
+    <w:lvl w:ilvl="2" w:tentative="1">
+      <w:start w:val="1"/>
+      <w:numFmt w:val="bullet"/>
+      <w:lvlText w:val=""/>
+      <w:lvlJc w:val="left"/>
+      <w:pPr>
+        <w:tabs>
+          <w:tab w:val="num" w:pos="2160"/>
+        </w:tabs>
+        <w:ind w:left="2160" w:hanging="360"/>
+      </w:pPr>
+      <w:rPr>
+        <w:rFonts w:ascii="Wingdings" w:hAnsi="Wingdings" w:hint="default"/>
+        <w:sz w:val="20"/>
+      </w:rPr>
+    </w:lvl>
+    <w:lvl w:ilvl="3" w:tentative="1">
+      <w:start w:val="1"/>
+      <w:numFmt w:val="bullet"/>
+      <w:lvlText w:val=""/>
+      <w:lvlJc w:val="left"/>
+      <w:pPr>
+        <w:tabs>
+          <w:tab w:val="num" w:pos="2880"/>
+        </w:tabs>
+        <w:ind w:left="2880" w:hanging="360"/>
+      </w:pPr>
+      <w:rPr>
+        <w:rFonts w:ascii="Wingdings" w:hAnsi="Wingdings" w:hint="default"/>
+        <w:sz w:val="20"/>
+      </w:rPr>
+    </w:lvl>
+    <w:lvl w:ilvl="4" w:tentative="1">
+      <w:start w:val="1"/>
+      <w:numFmt w:val="bullet"/>
+      <w:lvlText w:val=""/>
+      <w:lvlJc w:val="left"/>
+      <w:pPr>
+        <w:tabs>
+          <w:tab w:val="num" w:pos="3600"/>
+        </w:tabs>
+        <w:ind w:left="3600" w:hanging="360"/>
+      </w:pPr>
+      <w:rPr>
+        <w:rFonts w:ascii="Wingdings" w:hAnsi="Wingdings" w:hint="default"/>
+        <w:sz w:val="20"/>
+      </w:rPr>
+    </w:lvl>
+    <w:lvl w:ilvl="5" w:tentative="1">
+      <w:start w:val="1"/>
+      <w:numFmt w:val="bullet"/>
+      <w:lvlText w:val=""/>
+      <w:lvlJc w:val="left"/>
+      <w:pPr>
+        <w:tabs>
+          <w:tab w:val="num" w:pos="4320"/>
+        </w:tabs>
+        <w:ind w:left="4320" w:hanging="360"/>
+      </w:pPr>
+      <w:rPr>
+        <w:rFonts w:ascii="Wingdings" w:hAnsi="Wingdings" w:hint="default"/>
+        <w:sz w:val="20"/>
+      </w:rPr>
+    </w:lvl>
+    <w:lvl w:ilvl="6" w:tentative="1">
+      <w:start w:val="1"/>
+      <w:numFmt w:val="bullet"/>
+      <w:lvlText w:val=""/>
+      <w:lvlJc w:val="left"/>
+      <w:pPr>
+        <w:tabs>
+          <w:tab w:val="num" w:pos="5040"/>
+        </w:tabs>
+        <w:ind w:left="5040" w:hanging="360"/>
+      </w:pPr>
+      <w:rPr>
+        <w:rFonts w:ascii="Wingdings" w:hAnsi="Wingdings" w:hint="default"/>
+        <w:sz w:val="20"/>
+      </w:rPr>
+    </w:lvl>
+    <w:lvl w:ilvl="7" w:tentative="1">
+      <w:start w:val="1"/>
+      <w:numFmt w:val="bullet"/>
+      <w:lvlText w:val=""/>
+      <w:lvlJc w:val="left"/>
+      <w:pPr>
+        <w:tabs>
+          <w:tab w:val="num" w:pos="5760"/>
+        </w:tabs>
+        <w:ind w:left="5760" w:hanging="360"/>
+      </w:pPr>
+      <w:rPr>
+        <w:rFonts w:ascii="Wingdings" w:hAnsi="Wingdings" w:hint="default"/>
+        <w:sz w:val="20"/>
+      </w:rPr>
+    </w:lvl>
+    <w:lvl w:ilvl="8" w:tentative="1">
+      <w:start w:val="1"/>
+      <w:numFmt w:val="bullet"/>
+      <w:lvlText w:val=""/>
+      <w:lvlJc w:val="left"/>
+      <w:pPr>
+        <w:tabs>
+          <w:tab w:val="num" w:pos="6480"/>
+        </w:tabs>
+        <w:ind w:left="6480" w:hanging="360"/>
+      </w:pPr>
+      <w:rPr>
+        <w:rFonts w:ascii="Wingdings" w:hAnsi="Wingdings" w:hint="default"/>
+        <w:sz w:val="20"/>
+      </w:rPr>
+    </w:lvl>
+  </w:abstractNum>
+  <w:abstractNum w:abstractNumId="2" w15:restartNumberingAfterBreak="0">
     <w:nsid w:val="2C4E5803"/>
     <w:multiLevelType w:val="multilevel"/>
     <w:tmpl w:val="6818C3CC"/>
@@ -741,7 +1950,752 @@
       </w:rPr>
     </w:lvl>
   </w:abstractNum>
-  <w:abstractNum w:abstractNumId="1" w15:restartNumberingAfterBreak="0">
+  <w:abstractNum w:abstractNumId="3" w15:restartNumberingAfterBreak="0">
+    <w:nsid w:val="2EEF439D"/>
+    <w:multiLevelType w:val="multilevel"/>
+    <w:tmpl w:val="1C3EBF68"/>
+    <w:lvl w:ilvl="0">
+      <w:start w:val="1"/>
+      <w:numFmt w:val="bullet"/>
+      <w:lvlText w:val=""/>
+      <w:lvlJc w:val="left"/>
+      <w:pPr>
+        <w:tabs>
+          <w:tab w:val="num" w:pos="720"/>
+        </w:tabs>
+        <w:ind w:left="720" w:hanging="360"/>
+      </w:pPr>
+      <w:rPr>
+        <w:rFonts w:ascii="Symbol" w:hAnsi="Symbol" w:hint="default"/>
+        <w:sz w:val="20"/>
+      </w:rPr>
+    </w:lvl>
+    <w:lvl w:ilvl="1" w:tentative="1">
+      <w:start w:val="1"/>
+      <w:numFmt w:val="bullet"/>
+      <w:lvlText w:val="o"/>
+      <w:lvlJc w:val="left"/>
+      <w:pPr>
+        <w:tabs>
+          <w:tab w:val="num" w:pos="1440"/>
+        </w:tabs>
+        <w:ind w:left="1440" w:hanging="360"/>
+      </w:pPr>
+      <w:rPr>
+        <w:rFonts w:ascii="Courier New" w:hAnsi="Courier New" w:hint="default"/>
+        <w:sz w:val="20"/>
+      </w:rPr>
+    </w:lvl>
+    <w:lvl w:ilvl="2" w:tentative="1">
+      <w:start w:val="1"/>
+      <w:numFmt w:val="bullet"/>
+      <w:lvlText w:val=""/>
+      <w:lvlJc w:val="left"/>
+      <w:pPr>
+        <w:tabs>
+          <w:tab w:val="num" w:pos="2160"/>
+        </w:tabs>
+        <w:ind w:left="2160" w:hanging="360"/>
+      </w:pPr>
+      <w:rPr>
+        <w:rFonts w:ascii="Wingdings" w:hAnsi="Wingdings" w:hint="default"/>
+        <w:sz w:val="20"/>
+      </w:rPr>
+    </w:lvl>
+    <w:lvl w:ilvl="3" w:tentative="1">
+      <w:start w:val="1"/>
+      <w:numFmt w:val="bullet"/>
+      <w:lvlText w:val=""/>
+      <w:lvlJc w:val="left"/>
+      <w:pPr>
+        <w:tabs>
+          <w:tab w:val="num" w:pos="2880"/>
+        </w:tabs>
+        <w:ind w:left="2880" w:hanging="360"/>
+      </w:pPr>
+      <w:rPr>
+        <w:rFonts w:ascii="Wingdings" w:hAnsi="Wingdings" w:hint="default"/>
+        <w:sz w:val="20"/>
+      </w:rPr>
+    </w:lvl>
+    <w:lvl w:ilvl="4" w:tentative="1">
+      <w:start w:val="1"/>
+      <w:numFmt w:val="bullet"/>
+      <w:lvlText w:val=""/>
+      <w:lvlJc w:val="left"/>
+      <w:pPr>
+        <w:tabs>
+          <w:tab w:val="num" w:pos="3600"/>
+        </w:tabs>
+        <w:ind w:left="3600" w:hanging="360"/>
+      </w:pPr>
+      <w:rPr>
+        <w:rFonts w:ascii="Wingdings" w:hAnsi="Wingdings" w:hint="default"/>
+        <w:sz w:val="20"/>
+      </w:rPr>
+    </w:lvl>
+    <w:lvl w:ilvl="5" w:tentative="1">
+      <w:start w:val="1"/>
+      <w:numFmt w:val="bullet"/>
+      <w:lvlText w:val=""/>
+      <w:lvlJc w:val="left"/>
+      <w:pPr>
+        <w:tabs>
+          <w:tab w:val="num" w:pos="4320"/>
+        </w:tabs>
+        <w:ind w:left="4320" w:hanging="360"/>
+      </w:pPr>
+      <w:rPr>
+        <w:rFonts w:ascii="Wingdings" w:hAnsi="Wingdings" w:hint="default"/>
+        <w:sz w:val="20"/>
+      </w:rPr>
+    </w:lvl>
+    <w:lvl w:ilvl="6" w:tentative="1">
+      <w:start w:val="1"/>
+      <w:numFmt w:val="bullet"/>
+      <w:lvlText w:val=""/>
+      <w:lvlJc w:val="left"/>
+      <w:pPr>
+        <w:tabs>
+          <w:tab w:val="num" w:pos="5040"/>
+        </w:tabs>
+        <w:ind w:left="5040" w:hanging="360"/>
+      </w:pPr>
+      <w:rPr>
+        <w:rFonts w:ascii="Wingdings" w:hAnsi="Wingdings" w:hint="default"/>
+        <w:sz w:val="20"/>
+      </w:rPr>
+    </w:lvl>
+    <w:lvl w:ilvl="7" w:tentative="1">
+      <w:start w:val="1"/>
+      <w:numFmt w:val="bullet"/>
+      <w:lvlText w:val=""/>
+      <w:lvlJc w:val="left"/>
+      <w:pPr>
+        <w:tabs>
+          <w:tab w:val="num" w:pos="5760"/>
+        </w:tabs>
+        <w:ind w:left="5760" w:hanging="360"/>
+      </w:pPr>
+      <w:rPr>
+        <w:rFonts w:ascii="Wingdings" w:hAnsi="Wingdings" w:hint="default"/>
+        <w:sz w:val="20"/>
+      </w:rPr>
+    </w:lvl>
+    <w:lvl w:ilvl="8" w:tentative="1">
+      <w:start w:val="1"/>
+      <w:numFmt w:val="bullet"/>
+      <w:lvlText w:val=""/>
+      <w:lvlJc w:val="left"/>
+      <w:pPr>
+        <w:tabs>
+          <w:tab w:val="num" w:pos="6480"/>
+        </w:tabs>
+        <w:ind w:left="6480" w:hanging="360"/>
+      </w:pPr>
+      <w:rPr>
+        <w:rFonts w:ascii="Wingdings" w:hAnsi="Wingdings" w:hint="default"/>
+        <w:sz w:val="20"/>
+      </w:rPr>
+    </w:lvl>
+  </w:abstractNum>
+  <w:abstractNum w:abstractNumId="4" w15:restartNumberingAfterBreak="0">
+    <w:nsid w:val="32470A98"/>
+    <w:multiLevelType w:val="multilevel"/>
+    <w:tmpl w:val="44D88E20"/>
+    <w:lvl w:ilvl="0">
+      <w:start w:val="1"/>
+      <w:numFmt w:val="bullet"/>
+      <w:lvlText w:val=""/>
+      <w:lvlJc w:val="left"/>
+      <w:pPr>
+        <w:tabs>
+          <w:tab w:val="num" w:pos="720"/>
+        </w:tabs>
+        <w:ind w:left="720" w:hanging="360"/>
+      </w:pPr>
+      <w:rPr>
+        <w:rFonts w:ascii="Symbol" w:hAnsi="Symbol" w:hint="default"/>
+        <w:sz w:val="20"/>
+      </w:rPr>
+    </w:lvl>
+    <w:lvl w:ilvl="1" w:tentative="1">
+      <w:start w:val="1"/>
+      <w:numFmt w:val="bullet"/>
+      <w:lvlText w:val="o"/>
+      <w:lvlJc w:val="left"/>
+      <w:pPr>
+        <w:tabs>
+          <w:tab w:val="num" w:pos="1440"/>
+        </w:tabs>
+        <w:ind w:left="1440" w:hanging="360"/>
+      </w:pPr>
+      <w:rPr>
+        <w:rFonts w:ascii="Courier New" w:hAnsi="Courier New" w:hint="default"/>
+        <w:sz w:val="20"/>
+      </w:rPr>
+    </w:lvl>
+    <w:lvl w:ilvl="2" w:tentative="1">
+      <w:start w:val="1"/>
+      <w:numFmt w:val="bullet"/>
+      <w:lvlText w:val=""/>
+      <w:lvlJc w:val="left"/>
+      <w:pPr>
+        <w:tabs>
+          <w:tab w:val="num" w:pos="2160"/>
+        </w:tabs>
+        <w:ind w:left="2160" w:hanging="360"/>
+      </w:pPr>
+      <w:rPr>
+        <w:rFonts w:ascii="Wingdings" w:hAnsi="Wingdings" w:hint="default"/>
+        <w:sz w:val="20"/>
+      </w:rPr>
+    </w:lvl>
+    <w:lvl w:ilvl="3" w:tentative="1">
+      <w:start w:val="1"/>
+      <w:numFmt w:val="bullet"/>
+      <w:lvlText w:val=""/>
+      <w:lvlJc w:val="left"/>
+      <w:pPr>
+        <w:tabs>
+          <w:tab w:val="num" w:pos="2880"/>
+        </w:tabs>
+        <w:ind w:left="2880" w:hanging="360"/>
+      </w:pPr>
+      <w:rPr>
+        <w:rFonts w:ascii="Wingdings" w:hAnsi="Wingdings" w:hint="default"/>
+        <w:sz w:val="20"/>
+      </w:rPr>
+    </w:lvl>
+    <w:lvl w:ilvl="4" w:tentative="1">
+      <w:start w:val="1"/>
+      <w:numFmt w:val="bullet"/>
+      <w:lvlText w:val=""/>
+      <w:lvlJc w:val="left"/>
+      <w:pPr>
+        <w:tabs>
+          <w:tab w:val="num" w:pos="3600"/>
+        </w:tabs>
+        <w:ind w:left="3600" w:hanging="360"/>
+      </w:pPr>
+      <w:rPr>
+        <w:rFonts w:ascii="Wingdings" w:hAnsi="Wingdings" w:hint="default"/>
+        <w:sz w:val="20"/>
+      </w:rPr>
+    </w:lvl>
+    <w:lvl w:ilvl="5" w:tentative="1">
+      <w:start w:val="1"/>
+      <w:numFmt w:val="bullet"/>
+      <w:lvlText w:val=""/>
+      <w:lvlJc w:val="left"/>
+      <w:pPr>
+        <w:tabs>
+          <w:tab w:val="num" w:pos="4320"/>
+        </w:tabs>
+        <w:ind w:left="4320" w:hanging="360"/>
+      </w:pPr>
+      <w:rPr>
+        <w:rFonts w:ascii="Wingdings" w:hAnsi="Wingdings" w:hint="default"/>
+        <w:sz w:val="20"/>
+      </w:rPr>
+    </w:lvl>
+    <w:lvl w:ilvl="6" w:tentative="1">
+      <w:start w:val="1"/>
+      <w:numFmt w:val="bullet"/>
+      <w:lvlText w:val=""/>
+      <w:lvlJc w:val="left"/>
+      <w:pPr>
+        <w:tabs>
+          <w:tab w:val="num" w:pos="5040"/>
+        </w:tabs>
+        <w:ind w:left="5040" w:hanging="360"/>
+      </w:pPr>
+      <w:rPr>
+        <w:rFonts w:ascii="Wingdings" w:hAnsi="Wingdings" w:hint="default"/>
+        <w:sz w:val="20"/>
+      </w:rPr>
+    </w:lvl>
+    <w:lvl w:ilvl="7" w:tentative="1">
+      <w:start w:val="1"/>
+      <w:numFmt w:val="bullet"/>
+      <w:lvlText w:val=""/>
+      <w:lvlJc w:val="left"/>
+      <w:pPr>
+        <w:tabs>
+          <w:tab w:val="num" w:pos="5760"/>
+        </w:tabs>
+        <w:ind w:left="5760" w:hanging="360"/>
+      </w:pPr>
+      <w:rPr>
+        <w:rFonts w:ascii="Wingdings" w:hAnsi="Wingdings" w:hint="default"/>
+        <w:sz w:val="20"/>
+      </w:rPr>
+    </w:lvl>
+    <w:lvl w:ilvl="8" w:tentative="1">
+      <w:start w:val="1"/>
+      <w:numFmt w:val="bullet"/>
+      <w:lvlText w:val=""/>
+      <w:lvlJc w:val="left"/>
+      <w:pPr>
+        <w:tabs>
+          <w:tab w:val="num" w:pos="6480"/>
+        </w:tabs>
+        <w:ind w:left="6480" w:hanging="360"/>
+      </w:pPr>
+      <w:rPr>
+        <w:rFonts w:ascii="Wingdings" w:hAnsi="Wingdings" w:hint="default"/>
+        <w:sz w:val="20"/>
+      </w:rPr>
+    </w:lvl>
+  </w:abstractNum>
+  <w:abstractNum w:abstractNumId="5" w15:restartNumberingAfterBreak="0">
+    <w:nsid w:val="3E1C6DA8"/>
+    <w:multiLevelType w:val="multilevel"/>
+    <w:tmpl w:val="1A1ACCC8"/>
+    <w:lvl w:ilvl="0">
+      <w:start w:val="1"/>
+      <w:numFmt w:val="bullet"/>
+      <w:lvlText w:val=""/>
+      <w:lvlJc w:val="left"/>
+      <w:pPr>
+        <w:tabs>
+          <w:tab w:val="num" w:pos="720"/>
+        </w:tabs>
+        <w:ind w:left="720" w:hanging="360"/>
+      </w:pPr>
+      <w:rPr>
+        <w:rFonts w:ascii="Symbol" w:hAnsi="Symbol" w:hint="default"/>
+        <w:sz w:val="20"/>
+      </w:rPr>
+    </w:lvl>
+    <w:lvl w:ilvl="1" w:tentative="1">
+      <w:start w:val="1"/>
+      <w:numFmt w:val="bullet"/>
+      <w:lvlText w:val="o"/>
+      <w:lvlJc w:val="left"/>
+      <w:pPr>
+        <w:tabs>
+          <w:tab w:val="num" w:pos="1440"/>
+        </w:tabs>
+        <w:ind w:left="1440" w:hanging="360"/>
+      </w:pPr>
+      <w:rPr>
+        <w:rFonts w:ascii="Courier New" w:hAnsi="Courier New" w:hint="default"/>
+        <w:sz w:val="20"/>
+      </w:rPr>
+    </w:lvl>
+    <w:lvl w:ilvl="2" w:tentative="1">
+      <w:start w:val="1"/>
+      <w:numFmt w:val="bullet"/>
+      <w:lvlText w:val=""/>
+      <w:lvlJc w:val="left"/>
+      <w:pPr>
+        <w:tabs>
+          <w:tab w:val="num" w:pos="2160"/>
+        </w:tabs>
+        <w:ind w:left="2160" w:hanging="360"/>
+      </w:pPr>
+      <w:rPr>
+        <w:rFonts w:ascii="Wingdings" w:hAnsi="Wingdings" w:hint="default"/>
+        <w:sz w:val="20"/>
+      </w:rPr>
+    </w:lvl>
+    <w:lvl w:ilvl="3" w:tentative="1">
+      <w:start w:val="1"/>
+      <w:numFmt w:val="bullet"/>
+      <w:lvlText w:val=""/>
+      <w:lvlJc w:val="left"/>
+      <w:pPr>
+        <w:tabs>
+          <w:tab w:val="num" w:pos="2880"/>
+        </w:tabs>
+        <w:ind w:left="2880" w:hanging="360"/>
+      </w:pPr>
+      <w:rPr>
+        <w:rFonts w:ascii="Wingdings" w:hAnsi="Wingdings" w:hint="default"/>
+        <w:sz w:val="20"/>
+      </w:rPr>
+    </w:lvl>
+    <w:lvl w:ilvl="4" w:tentative="1">
+      <w:start w:val="1"/>
+      <w:numFmt w:val="bullet"/>
+      <w:lvlText w:val=""/>
+      <w:lvlJc w:val="left"/>
+      <w:pPr>
+        <w:tabs>
+          <w:tab w:val="num" w:pos="3600"/>
+        </w:tabs>
+        <w:ind w:left="3600" w:hanging="360"/>
+      </w:pPr>
+      <w:rPr>
+        <w:rFonts w:ascii="Wingdings" w:hAnsi="Wingdings" w:hint="default"/>
+        <w:sz w:val="20"/>
+      </w:rPr>
+    </w:lvl>
+    <w:lvl w:ilvl="5" w:tentative="1">
+      <w:start w:val="1"/>
+      <w:numFmt w:val="bullet"/>
+      <w:lvlText w:val=""/>
+      <w:lvlJc w:val="left"/>
+      <w:pPr>
+        <w:tabs>
+          <w:tab w:val="num" w:pos="4320"/>
+        </w:tabs>
+        <w:ind w:left="4320" w:hanging="360"/>
+      </w:pPr>
+      <w:rPr>
+        <w:rFonts w:ascii="Wingdings" w:hAnsi="Wingdings" w:hint="default"/>
+        <w:sz w:val="20"/>
+      </w:rPr>
+    </w:lvl>
+    <w:lvl w:ilvl="6" w:tentative="1">
+      <w:start w:val="1"/>
+      <w:numFmt w:val="bullet"/>
+      <w:lvlText w:val=""/>
+      <w:lvlJc w:val="left"/>
+      <w:pPr>
+        <w:tabs>
+          <w:tab w:val="num" w:pos="5040"/>
+        </w:tabs>
+        <w:ind w:left="5040" w:hanging="360"/>
+      </w:pPr>
+      <w:rPr>
+        <w:rFonts w:ascii="Wingdings" w:hAnsi="Wingdings" w:hint="default"/>
+        <w:sz w:val="20"/>
+      </w:rPr>
+    </w:lvl>
+    <w:lvl w:ilvl="7" w:tentative="1">
+      <w:start w:val="1"/>
+      <w:numFmt w:val="bullet"/>
+      <w:lvlText w:val=""/>
+      <w:lvlJc w:val="left"/>
+      <w:pPr>
+        <w:tabs>
+          <w:tab w:val="num" w:pos="5760"/>
+        </w:tabs>
+        <w:ind w:left="5760" w:hanging="360"/>
+      </w:pPr>
+      <w:rPr>
+        <w:rFonts w:ascii="Wingdings" w:hAnsi="Wingdings" w:hint="default"/>
+        <w:sz w:val="20"/>
+      </w:rPr>
+    </w:lvl>
+    <w:lvl w:ilvl="8" w:tentative="1">
+      <w:start w:val="1"/>
+      <w:numFmt w:val="bullet"/>
+      <w:lvlText w:val=""/>
+      <w:lvlJc w:val="left"/>
+      <w:pPr>
+        <w:tabs>
+          <w:tab w:val="num" w:pos="6480"/>
+        </w:tabs>
+        <w:ind w:left="6480" w:hanging="360"/>
+      </w:pPr>
+      <w:rPr>
+        <w:rFonts w:ascii="Wingdings" w:hAnsi="Wingdings" w:hint="default"/>
+        <w:sz w:val="20"/>
+      </w:rPr>
+    </w:lvl>
+  </w:abstractNum>
+  <w:abstractNum w:abstractNumId="6" w15:restartNumberingAfterBreak="0">
+    <w:nsid w:val="3E1D1EED"/>
+    <w:multiLevelType w:val="multilevel"/>
+    <w:tmpl w:val="591267F4"/>
+    <w:lvl w:ilvl="0">
+      <w:start w:val="1"/>
+      <w:numFmt w:val="bullet"/>
+      <w:lvlText w:val=""/>
+      <w:lvlJc w:val="left"/>
+      <w:pPr>
+        <w:tabs>
+          <w:tab w:val="num" w:pos="720"/>
+        </w:tabs>
+        <w:ind w:left="720" w:hanging="360"/>
+      </w:pPr>
+      <w:rPr>
+        <w:rFonts w:ascii="Symbol" w:hAnsi="Symbol" w:hint="default"/>
+        <w:sz w:val="20"/>
+      </w:rPr>
+    </w:lvl>
+    <w:lvl w:ilvl="1" w:tentative="1">
+      <w:start w:val="1"/>
+      <w:numFmt w:val="bullet"/>
+      <w:lvlText w:val="o"/>
+      <w:lvlJc w:val="left"/>
+      <w:pPr>
+        <w:tabs>
+          <w:tab w:val="num" w:pos="1440"/>
+        </w:tabs>
+        <w:ind w:left="1440" w:hanging="360"/>
+      </w:pPr>
+      <w:rPr>
+        <w:rFonts w:ascii="Courier New" w:hAnsi="Courier New" w:hint="default"/>
+        <w:sz w:val="20"/>
+      </w:rPr>
+    </w:lvl>
+    <w:lvl w:ilvl="2" w:tentative="1">
+      <w:start w:val="1"/>
+      <w:numFmt w:val="bullet"/>
+      <w:lvlText w:val=""/>
+      <w:lvlJc w:val="left"/>
+      <w:pPr>
+        <w:tabs>
+          <w:tab w:val="num" w:pos="2160"/>
+        </w:tabs>
+        <w:ind w:left="2160" w:hanging="360"/>
+      </w:pPr>
+      <w:rPr>
+        <w:rFonts w:ascii="Wingdings" w:hAnsi="Wingdings" w:hint="default"/>
+        <w:sz w:val="20"/>
+      </w:rPr>
+    </w:lvl>
+    <w:lvl w:ilvl="3" w:tentative="1">
+      <w:start w:val="1"/>
+      <w:numFmt w:val="bullet"/>
+      <w:lvlText w:val=""/>
+      <w:lvlJc w:val="left"/>
+      <w:pPr>
+        <w:tabs>
+          <w:tab w:val="num" w:pos="2880"/>
+        </w:tabs>
+        <w:ind w:left="2880" w:hanging="360"/>
+      </w:pPr>
+      <w:rPr>
+        <w:rFonts w:ascii="Wingdings" w:hAnsi="Wingdings" w:hint="default"/>
+        <w:sz w:val="20"/>
+      </w:rPr>
+    </w:lvl>
+    <w:lvl w:ilvl="4" w:tentative="1">
+      <w:start w:val="1"/>
+      <w:numFmt w:val="bullet"/>
+      <w:lvlText w:val=""/>
+      <w:lvlJc w:val="left"/>
+      <w:pPr>
+        <w:tabs>
+          <w:tab w:val="num" w:pos="3600"/>
+        </w:tabs>
+        <w:ind w:left="3600" w:hanging="360"/>
+      </w:pPr>
+      <w:rPr>
+        <w:rFonts w:ascii="Wingdings" w:hAnsi="Wingdings" w:hint="default"/>
+        <w:sz w:val="20"/>
+      </w:rPr>
+    </w:lvl>
+    <w:lvl w:ilvl="5" w:tentative="1">
+      <w:start w:val="1"/>
+      <w:numFmt w:val="bullet"/>
+      <w:lvlText w:val=""/>
+      <w:lvlJc w:val="left"/>
+      <w:pPr>
+        <w:tabs>
+          <w:tab w:val="num" w:pos="4320"/>
+        </w:tabs>
+        <w:ind w:left="4320" w:hanging="360"/>
+      </w:pPr>
+      <w:rPr>
+        <w:rFonts w:ascii="Wingdings" w:hAnsi="Wingdings" w:hint="default"/>
+        <w:sz w:val="20"/>
+      </w:rPr>
+    </w:lvl>
+    <w:lvl w:ilvl="6" w:tentative="1">
+      <w:start w:val="1"/>
+      <w:numFmt w:val="bullet"/>
+      <w:lvlText w:val=""/>
+      <w:lvlJc w:val="left"/>
+      <w:pPr>
+        <w:tabs>
+          <w:tab w:val="num" w:pos="5040"/>
+        </w:tabs>
+        <w:ind w:left="5040" w:hanging="360"/>
+      </w:pPr>
+      <w:rPr>
+        <w:rFonts w:ascii="Wingdings" w:hAnsi="Wingdings" w:hint="default"/>
+        <w:sz w:val="20"/>
+      </w:rPr>
+    </w:lvl>
+    <w:lvl w:ilvl="7" w:tentative="1">
+      <w:start w:val="1"/>
+      <w:numFmt w:val="bullet"/>
+      <w:lvlText w:val=""/>
+      <w:lvlJc w:val="left"/>
+      <w:pPr>
+        <w:tabs>
+          <w:tab w:val="num" w:pos="5760"/>
+        </w:tabs>
+        <w:ind w:left="5760" w:hanging="360"/>
+      </w:pPr>
+      <w:rPr>
+        <w:rFonts w:ascii="Wingdings" w:hAnsi="Wingdings" w:hint="default"/>
+        <w:sz w:val="20"/>
+      </w:rPr>
+    </w:lvl>
+    <w:lvl w:ilvl="8" w:tentative="1">
+      <w:start w:val="1"/>
+      <w:numFmt w:val="bullet"/>
+      <w:lvlText w:val=""/>
+      <w:lvlJc w:val="left"/>
+      <w:pPr>
+        <w:tabs>
+          <w:tab w:val="num" w:pos="6480"/>
+        </w:tabs>
+        <w:ind w:left="6480" w:hanging="360"/>
+      </w:pPr>
+      <w:rPr>
+        <w:rFonts w:ascii="Wingdings" w:hAnsi="Wingdings" w:hint="default"/>
+        <w:sz w:val="20"/>
+      </w:rPr>
+    </w:lvl>
+  </w:abstractNum>
+  <w:abstractNum w:abstractNumId="7" w15:restartNumberingAfterBreak="0">
+    <w:nsid w:val="3FE57037"/>
+    <w:multiLevelType w:val="multilevel"/>
+    <w:tmpl w:val="96C20038"/>
+    <w:lvl w:ilvl="0">
+      <w:start w:val="1"/>
+      <w:numFmt w:val="bullet"/>
+      <w:lvlText w:val=""/>
+      <w:lvlJc w:val="left"/>
+      <w:pPr>
+        <w:tabs>
+          <w:tab w:val="num" w:pos="720"/>
+        </w:tabs>
+        <w:ind w:left="720" w:hanging="360"/>
+      </w:pPr>
+      <w:rPr>
+        <w:rFonts w:ascii="Symbol" w:hAnsi="Symbol" w:hint="default"/>
+        <w:sz w:val="20"/>
+      </w:rPr>
+    </w:lvl>
+    <w:lvl w:ilvl="1" w:tentative="1">
+      <w:start w:val="1"/>
+      <w:numFmt w:val="bullet"/>
+      <w:lvlText w:val="o"/>
+      <w:lvlJc w:val="left"/>
+      <w:pPr>
+        <w:tabs>
+          <w:tab w:val="num" w:pos="1440"/>
+        </w:tabs>
+        <w:ind w:left="1440" w:hanging="360"/>
+      </w:pPr>
+      <w:rPr>
+        <w:rFonts w:ascii="Courier New" w:hAnsi="Courier New" w:hint="default"/>
+        <w:sz w:val="20"/>
+      </w:rPr>
+    </w:lvl>
+    <w:lvl w:ilvl="2" w:tentative="1">
+      <w:start w:val="1"/>
+      <w:numFmt w:val="bullet"/>
+      <w:lvlText w:val=""/>
+      <w:lvlJc w:val="left"/>
+      <w:pPr>
+        <w:tabs>
+          <w:tab w:val="num" w:pos="2160"/>
+        </w:tabs>
+        <w:ind w:left="2160" w:hanging="360"/>
+      </w:pPr>
+      <w:rPr>
+        <w:rFonts w:ascii="Wingdings" w:hAnsi="Wingdings" w:hint="default"/>
+        <w:sz w:val="20"/>
+      </w:rPr>
+    </w:lvl>
+    <w:lvl w:ilvl="3" w:tentative="1">
+      <w:start w:val="1"/>
+      <w:numFmt w:val="bullet"/>
+      <w:lvlText w:val=""/>
+      <w:lvlJc w:val="left"/>
+      <w:pPr>
+        <w:tabs>
+          <w:tab w:val="num" w:pos="2880"/>
+        </w:tabs>
+        <w:ind w:left="2880" w:hanging="360"/>
+      </w:pPr>
+      <w:rPr>
+        <w:rFonts w:ascii="Wingdings" w:hAnsi="Wingdings" w:hint="default"/>
+        <w:sz w:val="20"/>
+      </w:rPr>
+    </w:lvl>
+    <w:lvl w:ilvl="4" w:tentative="1">
+      <w:start w:val="1"/>
+      <w:numFmt w:val="bullet"/>
+      <w:lvlText w:val=""/>
+      <w:lvlJc w:val="left"/>
+      <w:pPr>
+        <w:tabs>
+          <w:tab w:val="num" w:pos="3600"/>
+        </w:tabs>
+        <w:ind w:left="3600" w:hanging="360"/>
+      </w:pPr>
+      <w:rPr>
+        <w:rFonts w:ascii="Wingdings" w:hAnsi="Wingdings" w:hint="default"/>
+        <w:sz w:val="20"/>
+      </w:rPr>
+    </w:lvl>
+    <w:lvl w:ilvl="5" w:tentative="1">
+      <w:start w:val="1"/>
+      <w:numFmt w:val="bullet"/>
+      <w:lvlText w:val=""/>
+      <w:lvlJc w:val="left"/>
+      <w:pPr>
+        <w:tabs>
+          <w:tab w:val="num" w:pos="4320"/>
+        </w:tabs>
+        <w:ind w:left="4320" w:hanging="360"/>
+      </w:pPr>
+      <w:rPr>
+        <w:rFonts w:ascii="Wingdings" w:hAnsi="Wingdings" w:hint="default"/>
+        <w:sz w:val="20"/>
+      </w:rPr>
+    </w:lvl>
+    <w:lvl w:ilvl="6" w:tentative="1">
+      <w:start w:val="1"/>
+      <w:numFmt w:val="bullet"/>
+      <w:lvlText w:val=""/>
+      <w:lvlJc w:val="left"/>
+      <w:pPr>
+        <w:tabs>
+          <w:tab w:val="num" w:pos="5040"/>
+        </w:tabs>
+        <w:ind w:left="5040" w:hanging="360"/>
+      </w:pPr>
+      <w:rPr>
+        <w:rFonts w:ascii="Wingdings" w:hAnsi="Wingdings" w:hint="default"/>
+        <w:sz w:val="20"/>
+      </w:rPr>
+    </w:lvl>
+    <w:lvl w:ilvl="7" w:tentative="1">
+      <w:start w:val="1"/>
+      <w:numFmt w:val="bullet"/>
+      <w:lvlText w:val=""/>
+      <w:lvlJc w:val="left"/>
+      <w:pPr>
+        <w:tabs>
+          <w:tab w:val="num" w:pos="5760"/>
+        </w:tabs>
+        <w:ind w:left="5760" w:hanging="360"/>
+      </w:pPr>
+      <w:rPr>
+        <w:rFonts w:ascii="Wingdings" w:hAnsi="Wingdings" w:hint="default"/>
+        <w:sz w:val="20"/>
+      </w:rPr>
+    </w:lvl>
+    <w:lvl w:ilvl="8" w:tentative="1">
+      <w:start w:val="1"/>
+      <w:numFmt w:val="bullet"/>
+      <w:lvlText w:val=""/>
+      <w:lvlJc w:val="left"/>
+      <w:pPr>
+        <w:tabs>
+          <w:tab w:val="num" w:pos="6480"/>
+        </w:tabs>
+        <w:ind w:left="6480" w:hanging="360"/>
+      </w:pPr>
+      <w:rPr>
+        <w:rFonts w:ascii="Wingdings" w:hAnsi="Wingdings" w:hint="default"/>
+        <w:sz w:val="20"/>
+      </w:rPr>
+    </w:lvl>
+  </w:abstractNum>
+  <w:abstractNum w:abstractNumId="8" w15:restartNumberingAfterBreak="0">
     <w:nsid w:val="48D2547C"/>
     <w:multiLevelType w:val="multilevel"/>
     <w:tmpl w:val="A7FE4386"/>
@@ -890,7 +2844,305 @@
       </w:rPr>
     </w:lvl>
   </w:abstractNum>
-  <w:abstractNum w:abstractNumId="2" w15:restartNumberingAfterBreak="0">
+  <w:abstractNum w:abstractNumId="9" w15:restartNumberingAfterBreak="0">
+    <w:nsid w:val="4A7A630E"/>
+    <w:multiLevelType w:val="multilevel"/>
+    <w:tmpl w:val="CB24D866"/>
+    <w:lvl w:ilvl="0">
+      <w:start w:val="1"/>
+      <w:numFmt w:val="bullet"/>
+      <w:lvlText w:val=""/>
+      <w:lvlJc w:val="left"/>
+      <w:pPr>
+        <w:tabs>
+          <w:tab w:val="num" w:pos="720"/>
+        </w:tabs>
+        <w:ind w:left="720" w:hanging="360"/>
+      </w:pPr>
+      <w:rPr>
+        <w:rFonts w:ascii="Symbol" w:hAnsi="Symbol" w:hint="default"/>
+        <w:sz w:val="20"/>
+      </w:rPr>
+    </w:lvl>
+    <w:lvl w:ilvl="1" w:tentative="1">
+      <w:start w:val="1"/>
+      <w:numFmt w:val="bullet"/>
+      <w:lvlText w:val="o"/>
+      <w:lvlJc w:val="left"/>
+      <w:pPr>
+        <w:tabs>
+          <w:tab w:val="num" w:pos="1440"/>
+        </w:tabs>
+        <w:ind w:left="1440" w:hanging="360"/>
+      </w:pPr>
+      <w:rPr>
+        <w:rFonts w:ascii="Courier New" w:hAnsi="Courier New" w:hint="default"/>
+        <w:sz w:val="20"/>
+      </w:rPr>
+    </w:lvl>
+    <w:lvl w:ilvl="2" w:tentative="1">
+      <w:start w:val="1"/>
+      <w:numFmt w:val="bullet"/>
+      <w:lvlText w:val=""/>
+      <w:lvlJc w:val="left"/>
+      <w:pPr>
+        <w:tabs>
+          <w:tab w:val="num" w:pos="2160"/>
+        </w:tabs>
+        <w:ind w:left="2160" w:hanging="360"/>
+      </w:pPr>
+      <w:rPr>
+        <w:rFonts w:ascii="Wingdings" w:hAnsi="Wingdings" w:hint="default"/>
+        <w:sz w:val="20"/>
+      </w:rPr>
+    </w:lvl>
+    <w:lvl w:ilvl="3" w:tentative="1">
+      <w:start w:val="1"/>
+      <w:numFmt w:val="bullet"/>
+      <w:lvlText w:val=""/>
+      <w:lvlJc w:val="left"/>
+      <w:pPr>
+        <w:tabs>
+          <w:tab w:val="num" w:pos="2880"/>
+        </w:tabs>
+        <w:ind w:left="2880" w:hanging="360"/>
+      </w:pPr>
+      <w:rPr>
+        <w:rFonts w:ascii="Wingdings" w:hAnsi="Wingdings" w:hint="default"/>
+        <w:sz w:val="20"/>
+      </w:rPr>
+    </w:lvl>
+    <w:lvl w:ilvl="4" w:tentative="1">
+      <w:start w:val="1"/>
+      <w:numFmt w:val="bullet"/>
+      <w:lvlText w:val=""/>
+      <w:lvlJc w:val="left"/>
+      <w:pPr>
+        <w:tabs>
+          <w:tab w:val="num" w:pos="3600"/>
+        </w:tabs>
+        <w:ind w:left="3600" w:hanging="360"/>
+      </w:pPr>
+      <w:rPr>
+        <w:rFonts w:ascii="Wingdings" w:hAnsi="Wingdings" w:hint="default"/>
+        <w:sz w:val="20"/>
+      </w:rPr>
+    </w:lvl>
+    <w:lvl w:ilvl="5" w:tentative="1">
+      <w:start w:val="1"/>
+      <w:numFmt w:val="bullet"/>
+      <w:lvlText w:val=""/>
+      <w:lvlJc w:val="left"/>
+      <w:pPr>
+        <w:tabs>
+          <w:tab w:val="num" w:pos="4320"/>
+        </w:tabs>
+        <w:ind w:left="4320" w:hanging="360"/>
+      </w:pPr>
+      <w:rPr>
+        <w:rFonts w:ascii="Wingdings" w:hAnsi="Wingdings" w:hint="default"/>
+        <w:sz w:val="20"/>
+      </w:rPr>
+    </w:lvl>
+    <w:lvl w:ilvl="6" w:tentative="1">
+      <w:start w:val="1"/>
+      <w:numFmt w:val="bullet"/>
+      <w:lvlText w:val=""/>
+      <w:lvlJc w:val="left"/>
+      <w:pPr>
+        <w:tabs>
+          <w:tab w:val="num" w:pos="5040"/>
+        </w:tabs>
+        <w:ind w:left="5040" w:hanging="360"/>
+      </w:pPr>
+      <w:rPr>
+        <w:rFonts w:ascii="Wingdings" w:hAnsi="Wingdings" w:hint="default"/>
+        <w:sz w:val="20"/>
+      </w:rPr>
+    </w:lvl>
+    <w:lvl w:ilvl="7" w:tentative="1">
+      <w:start w:val="1"/>
+      <w:numFmt w:val="bullet"/>
+      <w:lvlText w:val=""/>
+      <w:lvlJc w:val="left"/>
+      <w:pPr>
+        <w:tabs>
+          <w:tab w:val="num" w:pos="5760"/>
+        </w:tabs>
+        <w:ind w:left="5760" w:hanging="360"/>
+      </w:pPr>
+      <w:rPr>
+        <w:rFonts w:ascii="Wingdings" w:hAnsi="Wingdings" w:hint="default"/>
+        <w:sz w:val="20"/>
+      </w:rPr>
+    </w:lvl>
+    <w:lvl w:ilvl="8" w:tentative="1">
+      <w:start w:val="1"/>
+      <w:numFmt w:val="bullet"/>
+      <w:lvlText w:val=""/>
+      <w:lvlJc w:val="left"/>
+      <w:pPr>
+        <w:tabs>
+          <w:tab w:val="num" w:pos="6480"/>
+        </w:tabs>
+        <w:ind w:left="6480" w:hanging="360"/>
+      </w:pPr>
+      <w:rPr>
+        <w:rFonts w:ascii="Wingdings" w:hAnsi="Wingdings" w:hint="default"/>
+        <w:sz w:val="20"/>
+      </w:rPr>
+    </w:lvl>
+  </w:abstractNum>
+  <w:abstractNum w:abstractNumId="10" w15:restartNumberingAfterBreak="0">
+    <w:nsid w:val="53633C26"/>
+    <w:multiLevelType w:val="multilevel"/>
+    <w:tmpl w:val="7DC6AB04"/>
+    <w:lvl w:ilvl="0">
+      <w:start w:val="1"/>
+      <w:numFmt w:val="bullet"/>
+      <w:lvlText w:val=""/>
+      <w:lvlJc w:val="left"/>
+      <w:pPr>
+        <w:tabs>
+          <w:tab w:val="num" w:pos="720"/>
+        </w:tabs>
+        <w:ind w:left="720" w:hanging="360"/>
+      </w:pPr>
+      <w:rPr>
+        <w:rFonts w:ascii="Symbol" w:hAnsi="Symbol" w:hint="default"/>
+        <w:sz w:val="20"/>
+      </w:rPr>
+    </w:lvl>
+    <w:lvl w:ilvl="1" w:tentative="1">
+      <w:start w:val="1"/>
+      <w:numFmt w:val="bullet"/>
+      <w:lvlText w:val="o"/>
+      <w:lvlJc w:val="left"/>
+      <w:pPr>
+        <w:tabs>
+          <w:tab w:val="num" w:pos="1440"/>
+        </w:tabs>
+        <w:ind w:left="1440" w:hanging="360"/>
+      </w:pPr>
+      <w:rPr>
+        <w:rFonts w:ascii="Courier New" w:hAnsi="Courier New" w:hint="default"/>
+        <w:sz w:val="20"/>
+      </w:rPr>
+    </w:lvl>
+    <w:lvl w:ilvl="2" w:tentative="1">
+      <w:start w:val="1"/>
+      <w:numFmt w:val="bullet"/>
+      <w:lvlText w:val=""/>
+      <w:lvlJc w:val="left"/>
+      <w:pPr>
+        <w:tabs>
+          <w:tab w:val="num" w:pos="2160"/>
+        </w:tabs>
+        <w:ind w:left="2160" w:hanging="360"/>
+      </w:pPr>
+      <w:rPr>
+        <w:rFonts w:ascii="Wingdings" w:hAnsi="Wingdings" w:hint="default"/>
+        <w:sz w:val="20"/>
+      </w:rPr>
+    </w:lvl>
+    <w:lvl w:ilvl="3" w:tentative="1">
+      <w:start w:val="1"/>
+      <w:numFmt w:val="bullet"/>
+      <w:lvlText w:val=""/>
+      <w:lvlJc w:val="left"/>
+      <w:pPr>
+        <w:tabs>
+          <w:tab w:val="num" w:pos="2880"/>
+        </w:tabs>
+        <w:ind w:left="2880" w:hanging="360"/>
+      </w:pPr>
+      <w:rPr>
+        <w:rFonts w:ascii="Wingdings" w:hAnsi="Wingdings" w:hint="default"/>
+        <w:sz w:val="20"/>
+      </w:rPr>
+    </w:lvl>
+    <w:lvl w:ilvl="4" w:tentative="1">
+      <w:start w:val="1"/>
+      <w:numFmt w:val="bullet"/>
+      <w:lvlText w:val=""/>
+      <w:lvlJc w:val="left"/>
+      <w:pPr>
+        <w:tabs>
+          <w:tab w:val="num" w:pos="3600"/>
+        </w:tabs>
+        <w:ind w:left="3600" w:hanging="360"/>
+      </w:pPr>
+      <w:rPr>
+        <w:rFonts w:ascii="Wingdings" w:hAnsi="Wingdings" w:hint="default"/>
+        <w:sz w:val="20"/>
+      </w:rPr>
+    </w:lvl>
+    <w:lvl w:ilvl="5" w:tentative="1">
+      <w:start w:val="1"/>
+      <w:numFmt w:val="bullet"/>
+      <w:lvlText w:val=""/>
+      <w:lvlJc w:val="left"/>
+      <w:pPr>
+        <w:tabs>
+          <w:tab w:val="num" w:pos="4320"/>
+        </w:tabs>
+        <w:ind w:left="4320" w:hanging="360"/>
+      </w:pPr>
+      <w:rPr>
+        <w:rFonts w:ascii="Wingdings" w:hAnsi="Wingdings" w:hint="default"/>
+        <w:sz w:val="20"/>
+      </w:rPr>
+    </w:lvl>
+    <w:lvl w:ilvl="6" w:tentative="1">
+      <w:start w:val="1"/>
+      <w:numFmt w:val="bullet"/>
+      <w:lvlText w:val=""/>
+      <w:lvlJc w:val="left"/>
+      <w:pPr>
+        <w:tabs>
+          <w:tab w:val="num" w:pos="5040"/>
+        </w:tabs>
+        <w:ind w:left="5040" w:hanging="360"/>
+      </w:pPr>
+      <w:rPr>
+        <w:rFonts w:ascii="Wingdings" w:hAnsi="Wingdings" w:hint="default"/>
+        <w:sz w:val="20"/>
+      </w:rPr>
+    </w:lvl>
+    <w:lvl w:ilvl="7" w:tentative="1">
+      <w:start w:val="1"/>
+      <w:numFmt w:val="bullet"/>
+      <w:lvlText w:val=""/>
+      <w:lvlJc w:val="left"/>
+      <w:pPr>
+        <w:tabs>
+          <w:tab w:val="num" w:pos="5760"/>
+        </w:tabs>
+        <w:ind w:left="5760" w:hanging="360"/>
+      </w:pPr>
+      <w:rPr>
+        <w:rFonts w:ascii="Wingdings" w:hAnsi="Wingdings" w:hint="default"/>
+        <w:sz w:val="20"/>
+      </w:rPr>
+    </w:lvl>
+    <w:lvl w:ilvl="8" w:tentative="1">
+      <w:start w:val="1"/>
+      <w:numFmt w:val="bullet"/>
+      <w:lvlText w:val=""/>
+      <w:lvlJc w:val="left"/>
+      <w:pPr>
+        <w:tabs>
+          <w:tab w:val="num" w:pos="6480"/>
+        </w:tabs>
+        <w:ind w:left="6480" w:hanging="360"/>
+      </w:pPr>
+      <w:rPr>
+        <w:rFonts w:ascii="Wingdings" w:hAnsi="Wingdings" w:hint="default"/>
+        <w:sz w:val="20"/>
+      </w:rPr>
+    </w:lvl>
+  </w:abstractNum>
+  <w:abstractNum w:abstractNumId="11" w15:restartNumberingAfterBreak="0">
     <w:nsid w:val="6F8F1595"/>
     <w:multiLevelType w:val="multilevel"/>
     <w:tmpl w:val="477E362C"/>
@@ -1039,20 +3291,351 @@
       </w:rPr>
     </w:lvl>
   </w:abstractNum>
-  <w:num w:numId="1" w16cid:durableId="1536380346">
+  <w:abstractNum w:abstractNumId="12" w15:restartNumberingAfterBreak="0">
+    <w:nsid w:val="70E305A1"/>
+    <w:multiLevelType w:val="multilevel"/>
+    <w:tmpl w:val="57F49A2C"/>
+    <w:lvl w:ilvl="0">
+      <w:start w:val="1"/>
+      <w:numFmt w:val="bullet"/>
+      <w:lvlText w:val=""/>
+      <w:lvlJc w:val="left"/>
+      <w:pPr>
+        <w:tabs>
+          <w:tab w:val="num" w:pos="720"/>
+        </w:tabs>
+        <w:ind w:left="720" w:hanging="360"/>
+      </w:pPr>
+      <w:rPr>
+        <w:rFonts w:ascii="Symbol" w:hAnsi="Symbol" w:hint="default"/>
+        <w:sz w:val="20"/>
+      </w:rPr>
+    </w:lvl>
+    <w:lvl w:ilvl="1" w:tentative="1">
+      <w:start w:val="1"/>
+      <w:numFmt w:val="bullet"/>
+      <w:lvlText w:val="o"/>
+      <w:lvlJc w:val="left"/>
+      <w:pPr>
+        <w:tabs>
+          <w:tab w:val="num" w:pos="1440"/>
+        </w:tabs>
+        <w:ind w:left="1440" w:hanging="360"/>
+      </w:pPr>
+      <w:rPr>
+        <w:rFonts w:ascii="Courier New" w:hAnsi="Courier New" w:hint="default"/>
+        <w:sz w:val="20"/>
+      </w:rPr>
+    </w:lvl>
+    <w:lvl w:ilvl="2" w:tentative="1">
+      <w:start w:val="1"/>
+      <w:numFmt w:val="bullet"/>
+      <w:lvlText w:val=""/>
+      <w:lvlJc w:val="left"/>
+      <w:pPr>
+        <w:tabs>
+          <w:tab w:val="num" w:pos="2160"/>
+        </w:tabs>
+        <w:ind w:left="2160" w:hanging="360"/>
+      </w:pPr>
+      <w:rPr>
+        <w:rFonts w:ascii="Wingdings" w:hAnsi="Wingdings" w:hint="default"/>
+        <w:sz w:val="20"/>
+      </w:rPr>
+    </w:lvl>
+    <w:lvl w:ilvl="3" w:tentative="1">
+      <w:start w:val="1"/>
+      <w:numFmt w:val="bullet"/>
+      <w:lvlText w:val=""/>
+      <w:lvlJc w:val="left"/>
+      <w:pPr>
+        <w:tabs>
+          <w:tab w:val="num" w:pos="2880"/>
+        </w:tabs>
+        <w:ind w:left="2880" w:hanging="360"/>
+      </w:pPr>
+      <w:rPr>
+        <w:rFonts w:ascii="Wingdings" w:hAnsi="Wingdings" w:hint="default"/>
+        <w:sz w:val="20"/>
+      </w:rPr>
+    </w:lvl>
+    <w:lvl w:ilvl="4" w:tentative="1">
+      <w:start w:val="1"/>
+      <w:numFmt w:val="bullet"/>
+      <w:lvlText w:val=""/>
+      <w:lvlJc w:val="left"/>
+      <w:pPr>
+        <w:tabs>
+          <w:tab w:val="num" w:pos="3600"/>
+        </w:tabs>
+        <w:ind w:left="3600" w:hanging="360"/>
+      </w:pPr>
+      <w:rPr>
+        <w:rFonts w:ascii="Wingdings" w:hAnsi="Wingdings" w:hint="default"/>
+        <w:sz w:val="20"/>
+      </w:rPr>
+    </w:lvl>
+    <w:lvl w:ilvl="5" w:tentative="1">
+      <w:start w:val="1"/>
+      <w:numFmt w:val="bullet"/>
+      <w:lvlText w:val=""/>
+      <w:lvlJc w:val="left"/>
+      <w:pPr>
+        <w:tabs>
+          <w:tab w:val="num" w:pos="4320"/>
+        </w:tabs>
+        <w:ind w:left="4320" w:hanging="360"/>
+      </w:pPr>
+      <w:rPr>
+        <w:rFonts w:ascii="Wingdings" w:hAnsi="Wingdings" w:hint="default"/>
+        <w:sz w:val="20"/>
+      </w:rPr>
+    </w:lvl>
+    <w:lvl w:ilvl="6" w:tentative="1">
+      <w:start w:val="1"/>
+      <w:numFmt w:val="bullet"/>
+      <w:lvlText w:val=""/>
+      <w:lvlJc w:val="left"/>
+      <w:pPr>
+        <w:tabs>
+          <w:tab w:val="num" w:pos="5040"/>
+        </w:tabs>
+        <w:ind w:left="5040" w:hanging="360"/>
+      </w:pPr>
+      <w:rPr>
+        <w:rFonts w:ascii="Wingdings" w:hAnsi="Wingdings" w:hint="default"/>
+        <w:sz w:val="20"/>
+      </w:rPr>
+    </w:lvl>
+    <w:lvl w:ilvl="7" w:tentative="1">
+      <w:start w:val="1"/>
+      <w:numFmt w:val="bullet"/>
+      <w:lvlText w:val=""/>
+      <w:lvlJc w:val="left"/>
+      <w:pPr>
+        <w:tabs>
+          <w:tab w:val="num" w:pos="5760"/>
+        </w:tabs>
+        <w:ind w:left="5760" w:hanging="360"/>
+      </w:pPr>
+      <w:rPr>
+        <w:rFonts w:ascii="Wingdings" w:hAnsi="Wingdings" w:hint="default"/>
+        <w:sz w:val="20"/>
+      </w:rPr>
+    </w:lvl>
+    <w:lvl w:ilvl="8" w:tentative="1">
+      <w:start w:val="1"/>
+      <w:numFmt w:val="bullet"/>
+      <w:lvlText w:val=""/>
+      <w:lvlJc w:val="left"/>
+      <w:pPr>
+        <w:tabs>
+          <w:tab w:val="num" w:pos="6480"/>
+        </w:tabs>
+        <w:ind w:left="6480" w:hanging="360"/>
+      </w:pPr>
+      <w:rPr>
+        <w:rFonts w:ascii="Wingdings" w:hAnsi="Wingdings" w:hint="default"/>
+        <w:sz w:val="20"/>
+      </w:rPr>
+    </w:lvl>
+  </w:abstractNum>
+  <w:abstractNum w:abstractNumId="13" w15:restartNumberingAfterBreak="0">
+    <w:nsid w:val="7E14111F"/>
+    <w:multiLevelType w:val="multilevel"/>
+    <w:tmpl w:val="ECF62EA0"/>
+    <w:lvl w:ilvl="0">
+      <w:start w:val="1"/>
+      <w:numFmt w:val="bullet"/>
+      <w:lvlText w:val=""/>
+      <w:lvlJc w:val="left"/>
+      <w:pPr>
+        <w:tabs>
+          <w:tab w:val="num" w:pos="720"/>
+        </w:tabs>
+        <w:ind w:left="720" w:hanging="360"/>
+      </w:pPr>
+      <w:rPr>
+        <w:rFonts w:ascii="Symbol" w:hAnsi="Symbol" w:hint="default"/>
+        <w:sz w:val="20"/>
+      </w:rPr>
+    </w:lvl>
+    <w:lvl w:ilvl="1" w:tentative="1">
+      <w:start w:val="1"/>
+      <w:numFmt w:val="bullet"/>
+      <w:lvlText w:val="o"/>
+      <w:lvlJc w:val="left"/>
+      <w:pPr>
+        <w:tabs>
+          <w:tab w:val="num" w:pos="1440"/>
+        </w:tabs>
+        <w:ind w:left="1440" w:hanging="360"/>
+      </w:pPr>
+      <w:rPr>
+        <w:rFonts w:ascii="Courier New" w:hAnsi="Courier New" w:hint="default"/>
+        <w:sz w:val="20"/>
+      </w:rPr>
+    </w:lvl>
+    <w:lvl w:ilvl="2" w:tentative="1">
+      <w:start w:val="1"/>
+      <w:numFmt w:val="bullet"/>
+      <w:lvlText w:val=""/>
+      <w:lvlJc w:val="left"/>
+      <w:pPr>
+        <w:tabs>
+          <w:tab w:val="num" w:pos="2160"/>
+        </w:tabs>
+        <w:ind w:left="2160" w:hanging="360"/>
+      </w:pPr>
+      <w:rPr>
+        <w:rFonts w:ascii="Wingdings" w:hAnsi="Wingdings" w:hint="default"/>
+        <w:sz w:val="20"/>
+      </w:rPr>
+    </w:lvl>
+    <w:lvl w:ilvl="3" w:tentative="1">
+      <w:start w:val="1"/>
+      <w:numFmt w:val="bullet"/>
+      <w:lvlText w:val=""/>
+      <w:lvlJc w:val="left"/>
+      <w:pPr>
+        <w:tabs>
+          <w:tab w:val="num" w:pos="2880"/>
+        </w:tabs>
+        <w:ind w:left="2880" w:hanging="360"/>
+      </w:pPr>
+      <w:rPr>
+        <w:rFonts w:ascii="Wingdings" w:hAnsi="Wingdings" w:hint="default"/>
+        <w:sz w:val="20"/>
+      </w:rPr>
+    </w:lvl>
+    <w:lvl w:ilvl="4" w:tentative="1">
+      <w:start w:val="1"/>
+      <w:numFmt w:val="bullet"/>
+      <w:lvlText w:val=""/>
+      <w:lvlJc w:val="left"/>
+      <w:pPr>
+        <w:tabs>
+          <w:tab w:val="num" w:pos="3600"/>
+        </w:tabs>
+        <w:ind w:left="3600" w:hanging="360"/>
+      </w:pPr>
+      <w:rPr>
+        <w:rFonts w:ascii="Wingdings" w:hAnsi="Wingdings" w:hint="default"/>
+        <w:sz w:val="20"/>
+      </w:rPr>
+    </w:lvl>
+    <w:lvl w:ilvl="5" w:tentative="1">
+      <w:start w:val="1"/>
+      <w:numFmt w:val="bullet"/>
+      <w:lvlText w:val=""/>
+      <w:lvlJc w:val="left"/>
+      <w:pPr>
+        <w:tabs>
+          <w:tab w:val="num" w:pos="4320"/>
+        </w:tabs>
+        <w:ind w:left="4320" w:hanging="360"/>
+      </w:pPr>
+      <w:rPr>
+        <w:rFonts w:ascii="Wingdings" w:hAnsi="Wingdings" w:hint="default"/>
+        <w:sz w:val="20"/>
+      </w:rPr>
+    </w:lvl>
+    <w:lvl w:ilvl="6" w:tentative="1">
+      <w:start w:val="1"/>
+      <w:numFmt w:val="bullet"/>
+      <w:lvlText w:val=""/>
+      <w:lvlJc w:val="left"/>
+      <w:pPr>
+        <w:tabs>
+          <w:tab w:val="num" w:pos="5040"/>
+        </w:tabs>
+        <w:ind w:left="5040" w:hanging="360"/>
+      </w:pPr>
+      <w:rPr>
+        <w:rFonts w:ascii="Wingdings" w:hAnsi="Wingdings" w:hint="default"/>
+        <w:sz w:val="20"/>
+      </w:rPr>
+    </w:lvl>
+    <w:lvl w:ilvl="7" w:tentative="1">
+      <w:start w:val="1"/>
+      <w:numFmt w:val="bullet"/>
+      <w:lvlText w:val=""/>
+      <w:lvlJc w:val="left"/>
+      <w:pPr>
+        <w:tabs>
+          <w:tab w:val="num" w:pos="5760"/>
+        </w:tabs>
+        <w:ind w:left="5760" w:hanging="360"/>
+      </w:pPr>
+      <w:rPr>
+        <w:rFonts w:ascii="Wingdings" w:hAnsi="Wingdings" w:hint="default"/>
+        <w:sz w:val="20"/>
+      </w:rPr>
+    </w:lvl>
+    <w:lvl w:ilvl="8" w:tentative="1">
+      <w:start w:val="1"/>
+      <w:numFmt w:val="bullet"/>
+      <w:lvlText w:val=""/>
+      <w:lvlJc w:val="left"/>
+      <w:pPr>
+        <w:tabs>
+          <w:tab w:val="num" w:pos="6480"/>
+        </w:tabs>
+        <w:ind w:left="6480" w:hanging="360"/>
+      </w:pPr>
+      <w:rPr>
+        <w:rFonts w:ascii="Wingdings" w:hAnsi="Wingdings" w:hint="default"/>
+        <w:sz w:val="20"/>
+      </w:rPr>
+    </w:lvl>
+  </w:abstractNum>
+  <w:num w:numId="1">
+    <w:abstractNumId w:val="11"/>
+  </w:num>
+  <w:num w:numId="2">
     <w:abstractNumId w:val="2"/>
   </w:num>
-  <w:num w:numId="2" w16cid:durableId="284701083">
+  <w:num w:numId="3">
+    <w:abstractNumId w:val="8"/>
+  </w:num>
+  <w:num w:numId="4">
+    <w:abstractNumId w:val="7"/>
+  </w:num>
+  <w:num w:numId="5">
+    <w:abstractNumId w:val="10"/>
+  </w:num>
+  <w:num w:numId="6">
+    <w:abstractNumId w:val="4"/>
+  </w:num>
+  <w:num w:numId="7">
+    <w:abstractNumId w:val="12"/>
+  </w:num>
+  <w:num w:numId="8">
+    <w:abstractNumId w:val="13"/>
+  </w:num>
+  <w:num w:numId="9">
     <w:abstractNumId w:val="0"/>
   </w:num>
-  <w:num w:numId="3" w16cid:durableId="1702709618">
+  <w:num w:numId="10">
     <w:abstractNumId w:val="1"/>
+  </w:num>
+  <w:num w:numId="11">
+    <w:abstractNumId w:val="6"/>
+  </w:num>
+  <w:num w:numId="12">
+    <w:abstractNumId w:val="3"/>
+  </w:num>
+  <w:num w:numId="13">
+    <w:abstractNumId w:val="9"/>
+  </w:num>
+  <w:num w:numId="14">
+    <w:abstractNumId w:val="5"/>
   </w:num>
 </w:numbering>
 </file>
 
 <file path=word/styles.xml><?xml version="1.0" encoding="utf-8"?>
-<w:styles xmlns:mc="http://schemas.openxmlformats.org/markup-compatibility/2006" xmlns:r="http://schemas.openxmlformats.org/officeDocument/2006/relationships" xmlns:w="http://schemas.openxmlformats.org/wordprocessingml/2006/main" xmlns:w14="http://schemas.microsoft.com/office/word/2010/wordml" xmlns:w15="http://schemas.microsoft.com/office/word/2012/wordml" xmlns:w16cex="http://schemas.microsoft.com/office/word/2018/wordml/cex" xmlns:w16cid="http://schemas.microsoft.com/office/word/2016/wordml/cid" xmlns:w16="http://schemas.microsoft.com/office/word/2018/wordml" xmlns:w16du="http://schemas.microsoft.com/office/word/2023/wordml/word16du" xmlns:w16sdtdh="http://schemas.microsoft.com/office/word/2020/wordml/sdtdatahash" xmlns:w16sdtfl="http://schemas.microsoft.com/office/word/2024/wordml/sdtformatlock" xmlns:w16se="http://schemas.microsoft.com/office/word/2015/wordml/symex" mc:Ignorable="w14 w15 w16se w16cid w16 w16cex w16sdtdh w16sdtfl w16du">
+<w:styles xmlns:mc="http://schemas.openxmlformats.org/markup-compatibility/2006" xmlns:r="http://schemas.openxmlformats.org/officeDocument/2006/relationships" xmlns:w="http://schemas.openxmlformats.org/wordprocessingml/2006/main" xmlns:w14="http://schemas.microsoft.com/office/word/2010/wordml" xmlns:w15="http://schemas.microsoft.com/office/word/2012/wordml" xmlns:w16se="http://schemas.microsoft.com/office/word/2015/wordml/symex" mc:Ignorable="w14 w15 w16se">
   <w:docDefaults>
     <w:rPrDefault>
       <w:rPr>
@@ -1070,7 +3653,7 @@
       </w:pPr>
     </w:pPrDefault>
   </w:docDefaults>
-  <w:latentStyles w:defLockedState="0" w:defUIPriority="99" w:defSemiHidden="0" w:defUnhideWhenUsed="0" w:defQFormat="0" w:count="376">
+  <w:latentStyles w:defLockedState="0" w:defUIPriority="99" w:defSemiHidden="0" w:defUnhideWhenUsed="0" w:defQFormat="0" w:count="371">
     <w:lsdException w:name="Normal" w:uiPriority="0" w:qFormat="1"/>
     <w:lsdException w:name="heading 1" w:uiPriority="9" w:qFormat="1"/>
     <w:lsdException w:name="heading 2" w:semiHidden="1" w:uiPriority="9" w:unhideWhenUsed="1" w:qFormat="1"/>
@@ -1442,11 +4025,6 @@
     <w:lsdException w:name="List Table 5 Dark Accent 6" w:uiPriority="50"/>
     <w:lsdException w:name="List Table 6 Colorful Accent 6" w:uiPriority="51"/>
     <w:lsdException w:name="List Table 7 Colorful Accent 6" w:uiPriority="52"/>
-    <w:lsdException w:name="Mention" w:semiHidden="1" w:unhideWhenUsed="1"/>
-    <w:lsdException w:name="Smart Hyperlink" w:semiHidden="1" w:unhideWhenUsed="1"/>
-    <w:lsdException w:name="Hashtag" w:semiHidden="1" w:unhideWhenUsed="1"/>
-    <w:lsdException w:name="Unresolved Mention" w:semiHidden="1" w:unhideWhenUsed="1"/>
-    <w:lsdException w:name="Smart Link" w:semiHidden="1" w:unhideWhenUsed="1"/>
   </w:latentStyles>
   <w:style w:type="paragraph" w:default="1" w:styleId="Normal">
     <w:name w:val="Normal"/>
@@ -1654,6 +4232,7 @@
   <w:style w:type="character" w:default="1" w:styleId="Fuentedeprrafopredeter">
     <w:name w:val="Default Paragraph Font"/>
     <w:uiPriority w:val="1"/>
+    <w:semiHidden/>
     <w:unhideWhenUsed/>
   </w:style>
   <w:style w:type="table" w:default="1" w:styleId="Tablanormal">
@@ -1978,7 +4557,7 @@
       <w:u w:val="single"/>
     </w:rPr>
   </w:style>
-  <w:style w:type="character" w:styleId="Mencinsinresolver">
+  <w:style w:type="character" w:customStyle="1" w:styleId="UnresolvedMention">
     <w:name w:val="Unresolved Mention"/>
     <w:basedOn w:val="Fuentedeprrafopredeter"/>
     <w:uiPriority w:val="99"/>
@@ -1989,6 +4568,67 @@
       <w:color w:val="605E5C"/>
       <w:shd w:val="clear" w:color="auto" w:fill="E1DFDD"/>
     </w:rPr>
+  </w:style>
+  <w:style w:type="paragraph" w:styleId="NormalWeb">
+    <w:name w:val="Normal (Web)"/>
+    <w:basedOn w:val="Normal"/>
+    <w:uiPriority w:val="99"/>
+    <w:semiHidden/>
+    <w:unhideWhenUsed/>
+    <w:rsid w:val="00DA5100"/>
+    <w:pPr>
+      <w:spacing w:before="100" w:beforeAutospacing="1" w:after="100" w:afterAutospacing="1" w:line="240" w:lineRule="auto"/>
+    </w:pPr>
+    <w:rPr>
+      <w:rFonts w:ascii="Times New Roman" w:eastAsia="Times New Roman" w:hAnsi="Times New Roman" w:cs="Times New Roman"/>
+      <w:kern w:val="0"/>
+      <w:lang w:val="en-US"/>
+      <w14:ligatures w14:val="none"/>
+    </w:rPr>
+  </w:style>
+  <w:style w:type="paragraph" w:styleId="Encabezado">
+    <w:name w:val="header"/>
+    <w:basedOn w:val="Normal"/>
+    <w:link w:val="EncabezadoCar"/>
+    <w:uiPriority w:val="99"/>
+    <w:unhideWhenUsed/>
+    <w:rsid w:val="00DA5100"/>
+    <w:pPr>
+      <w:tabs>
+        <w:tab w:val="center" w:pos="4419"/>
+        <w:tab w:val="right" w:pos="8838"/>
+      </w:tabs>
+      <w:spacing w:after="0" w:line="240" w:lineRule="auto"/>
+    </w:pPr>
+  </w:style>
+  <w:style w:type="character" w:customStyle="1" w:styleId="EncabezadoCar">
+    <w:name w:val="Encabezado Car"/>
+    <w:basedOn w:val="Fuentedeprrafopredeter"/>
+    <w:link w:val="Encabezado"/>
+    <w:uiPriority w:val="99"/>
+    <w:rsid w:val="00DA5100"/>
+  </w:style>
+  <w:style w:type="paragraph" w:styleId="Piedepgina">
+    <w:name w:val="footer"/>
+    <w:basedOn w:val="Normal"/>
+    <w:link w:val="PiedepginaCar"/>
+    <w:uiPriority w:val="99"/>
+    <w:unhideWhenUsed/>
+    <w:rsid w:val="00DA5100"/>
+    <w:pPr>
+      <w:tabs>
+        <w:tab w:val="center" w:pos="4419"/>
+        <w:tab w:val="right" w:pos="8838"/>
+      </w:tabs>
+      <w:spacing w:after="0" w:line="240" w:lineRule="auto"/>
+    </w:pPr>
+  </w:style>
+  <w:style w:type="character" w:customStyle="1" w:styleId="PiedepginaCar">
+    <w:name w:val="Pie de página Car"/>
+    <w:basedOn w:val="Fuentedeprrafopredeter"/>
+    <w:link w:val="Piedepgina"/>
+    <w:uiPriority w:val="99"/>
+    <w:rsid w:val="00DA5100"/>
   </w:style>
 </w:styles>
 </file>

</xml_diff>